<commit_message>
Update the MA289-27-1 proposal and summary PDFs to the Times New Roman versions
Co-Authored-By: Claude Opus 5.5 <noreply@anthropic.com>
Claude-Session: https://claude.ai/code/session_01LktEwgLv6jhvgy7W4UNjwx
</commit_message>
<xml_diff>
--- a/ma289-27-1-proposal.docx
+++ b/ma289-27-1-proposal.docx
@@ -8,10 +8,10 @@
       </w:pPr>
       <w:r>
         <w:rPr>
-          <w:rFonts w:ascii="Calibri" w:cs="Calibri" w:eastAsia="Calibri" w:hAnsi="Calibri"/>
+          <w:rFonts w:ascii="Times New Roman" w:cs="Times New Roman" w:eastAsia="Times New Roman" w:hAnsi="Times New Roman"/>
           <w:b/>
           <w:bCs/>
-          <w:color w:val="1C4E80"/>
+          <w:color w:val="000000"/>
           <w:sz w:val="30"/>
           <w:szCs w:val="30"/>
         </w:rPr>
@@ -24,28 +24,28 @@
       </w:pPr>
       <w:r>
         <w:rPr>
-          <w:rFonts w:ascii="Calibri" w:cs="Calibri" w:eastAsia="Calibri" w:hAnsi="Calibri"/>
-          <w:color w:val="5A5A5A"/>
+          <w:rFonts w:ascii="Times New Roman" w:cs="Times New Roman" w:eastAsia="Times New Roman" w:hAnsi="Times New Roman"/>
+          <w:color w:val="000000"/>
           <w:sz w:val="17"/>
           <w:szCs w:val="17"/>
         </w:rPr>
-        <w:t xml:space="preserve">Research proposal  |  MA289-27-1 Independent Study  |  Cadet Dennis Pezan  |  Advisor: LTC Matthew Webb  |  27 September 2026</w:t>
+        <w:t xml:space="preserve">Research proposal  |  MA289-27-1 Independent Study  |  Cadet Dennis Pezan  |  Advisor: LTC Matthew Webb  |  30 September 2026</w:t>
       </w:r>
     </w:p>
     <w:p>
       <w:pPr>
         <w:keepNext/>
         <w:pBdr>
-          <w:bottom w:val="single" w:color="B8C4D2" w:sz="4" w:space="1"/>
+          <w:bottom w:val="single" w:color="000000" w:sz="4" w:space="1"/>
         </w:pBdr>
         <w:spacing w:after="25" w:before="70"/>
       </w:pPr>
       <w:r>
         <w:rPr>
-          <w:rFonts w:ascii="Calibri" w:cs="Calibri" w:eastAsia="Calibri" w:hAnsi="Calibri"/>
+          <w:rFonts w:ascii="Times New Roman" w:cs="Times New Roman" w:eastAsia="Times New Roman" w:hAnsi="Times New Roman"/>
           <w:b/>
           <w:bCs/>
-          <w:color w:val="1C4E80"/>
+          <w:color w:val="000000"/>
           <w:sz w:val="19"/>
           <w:szCs w:val="19"/>
         </w:rPr>
@@ -54,86 +54,86 @@
     </w:p>
     <w:p>
       <w:pPr>
-        <w:spacing w:after="40" w:before="0" w:line="238"/>
-      </w:pPr>
-      <w:r>
-        <w:rPr>
-          <w:rFonts w:ascii="Calibri" w:cs="Calibri" w:eastAsia="Calibri" w:hAnsi="Calibri"/>
-          <w:color w:val="1A1A1A"/>
+        <w:spacing w:after="40" w:before="0" w:line="234"/>
+      </w:pPr>
+      <w:r>
+        <w:rPr>
+          <w:rFonts w:ascii="Times New Roman" w:cs="Times New Roman" w:eastAsia="Times New Roman" w:hAnsi="Times New Roman"/>
+          <w:color w:val="000000"/>
+          <w:sz w:val="20"/>
+          <w:szCs w:val="20"/>
+        </w:rPr>
+        <w:t xml:space="preserve">This project tests whether LTC Webb's threat-adaptive RL interdiction agent, built on Ukrainian/Russian rail, still finds sound attacker strategies on a structurally different network: the sea delivery of crude oil to Taiwan's refineries. </w:t>
+      </w:r>
+      <w:r>
+        <w:rPr>
+          <w:rFonts w:ascii="Times New Roman" w:cs="Times New Roman" w:eastAsia="Times New Roman" w:hAnsi="Times New Roman"/>
+          <w:b/>
+          <w:bCs/>
+          <w:color w:val="000000"/>
+          <w:sz w:val="20"/>
+          <w:szCs w:val="20"/>
+        </w:rPr>
+        <w:t xml:space="preserve">Research question: </w:t>
+      </w:r>
+      <w:r>
+        <w:rPr>
+          <w:rFonts w:ascii="Times New Roman" w:cs="Times New Roman" w:eastAsia="Times New Roman" w:hAnsi="Times New Roman"/>
+          <w:color w:val="000000"/>
+          <w:sz w:val="20"/>
+          <w:szCs w:val="20"/>
+        </w:rPr>
+        <w:t xml:space="preserve">given one effort budget spread across different kinds of action, which sea lanes does an attacker act on to minimize crude reaching Taiwan, and are they distant chokepoints or Taiwan’s own approaches?</w:t>
+      </w:r>
+    </w:p>
+    <w:p>
+      <w:pPr>
+        <w:keepNext/>
+        <w:pBdr>
+          <w:bottom w:val="single" w:color="000000" w:sz="4" w:space="1"/>
+        </w:pBdr>
+        <w:spacing w:after="25" w:before="70"/>
+      </w:pPr>
+      <w:r>
+        <w:rPr>
+          <w:rFonts w:ascii="Times New Roman" w:cs="Times New Roman" w:eastAsia="Times New Roman" w:hAnsi="Times New Roman"/>
+          <w:b/>
+          <w:bCs/>
+          <w:color w:val="000000"/>
           <w:sz w:val="19"/>
           <w:szCs w:val="19"/>
         </w:rPr>
-        <w:t xml:space="preserve">This project tests whether LTC Webb's threat-adaptive RL interdiction agent, built on Ukrainian/Russian rail, still finds sound attacker strategies on a structurally different network: the sea delivery of crude oil to Taiwan's refineries. </w:t>
-      </w:r>
-      <w:r>
-        <w:rPr>
-          <w:rFonts w:ascii="Calibri" w:cs="Calibri" w:eastAsia="Calibri" w:hAnsi="Calibri"/>
+        <w:t xml:space="preserve">WHY THIS NETWORK</w:t>
+      </w:r>
+    </w:p>
+    <w:p>
+      <w:pPr>
+        <w:spacing w:after="40" w:before="0" w:line="234"/>
+      </w:pPr>
+      <w:r>
+        <w:rPr>
+          <w:rFonts w:ascii="Times New Roman" w:cs="Times New Roman" w:eastAsia="Times New Roman" w:hAnsi="Times New Roman"/>
+          <w:color w:val="000000"/>
+          <w:sz w:val="20"/>
+          <w:szCs w:val="20"/>
+        </w:rPr>
+        <w:t xml:space="preserve">Taiwan imports nearly all of its crude: in 2025, 61% from Persian Gulf producers through Hormuz, 27% from the U.S. Gulf Coast, 8% from Oman (EIA, 2026). Every barrel must pass a few named straits, so the open ocean reduces to a finite, closed graph. The structure is real: Hormuz has been largely closed since February 2026, and Taiwan reportedly rerouted through the Saudi Red Sea port of Yanbu, a route this network contains.</w:t>
+      </w:r>
+    </w:p>
+    <w:p>
+      <w:pPr>
+        <w:keepNext/>
+        <w:pBdr>
+          <w:bottom w:val="single" w:color="000000" w:sz="4" w:space="1"/>
+        </w:pBdr>
+        <w:spacing w:after="25" w:before="70"/>
+      </w:pPr>
+      <w:r>
+        <w:rPr>
+          <w:rFonts w:ascii="Times New Roman" w:cs="Times New Roman" w:eastAsia="Times New Roman" w:hAnsi="Times New Roman"/>
           <w:b/>
           <w:bCs/>
-          <w:color w:val="1A1A1A"/>
-          <w:sz w:val="19"/>
-          <w:szCs w:val="19"/>
-        </w:rPr>
-        <w:t xml:space="preserve">Research question: </w:t>
-      </w:r>
-      <w:r>
-        <w:rPr>
-          <w:rFonts w:ascii="Calibri" w:cs="Calibri" w:eastAsia="Calibri" w:hAnsi="Calibri"/>
-          <w:color w:val="1A1A1A"/>
-          <w:sz w:val="19"/>
-          <w:szCs w:val="19"/>
-        </w:rPr>
-        <w:t xml:space="preserve">given one effort budget spread across different kinds of action, which sea lanes does an attacker act on to minimize crude reaching Taiwan, and are they distant chokepoints or Taiwan’s own approaches?</w:t>
-      </w:r>
-    </w:p>
-    <w:p>
-      <w:pPr>
-        <w:keepNext/>
-        <w:pBdr>
-          <w:bottom w:val="single" w:color="B8C4D2" w:sz="4" w:space="1"/>
-        </w:pBdr>
-        <w:spacing w:after="25" w:before="70"/>
-      </w:pPr>
-      <w:r>
-        <w:rPr>
-          <w:rFonts w:ascii="Calibri" w:cs="Calibri" w:eastAsia="Calibri" w:hAnsi="Calibri"/>
-          <w:b/>
-          <w:bCs/>
-          <w:color w:val="1C4E80"/>
-          <w:sz w:val="19"/>
-          <w:szCs w:val="19"/>
-        </w:rPr>
-        <w:t xml:space="preserve">WHY THIS NETWORK</w:t>
-      </w:r>
-    </w:p>
-    <w:p>
-      <w:pPr>
-        <w:spacing w:after="40" w:before="0" w:line="238"/>
-      </w:pPr>
-      <w:r>
-        <w:rPr>
-          <w:rFonts w:ascii="Calibri" w:cs="Calibri" w:eastAsia="Calibri" w:hAnsi="Calibri"/>
-          <w:color w:val="1A1A1A"/>
-          <w:sz w:val="19"/>
-          <w:szCs w:val="19"/>
-        </w:rPr>
-        <w:t xml:space="preserve">Taiwan imports nearly all of its crude: in 2025, 61% from Persian Gulf producers through Hormuz, 27% from the U.S. Gulf Coast, 8% from Oman (EIA, 2026). Every barrel must pass a few named straits, so the open ocean reduces to a finite, closed graph. The structure is real: Hormuz has been largely closed since February 2026, and Taiwan reportedly rerouted through the Saudi Red Sea port of Yanbu, a route this network contains.</w:t>
-      </w:r>
-    </w:p>
-    <w:p>
-      <w:pPr>
-        <w:keepNext/>
-        <w:pBdr>
-          <w:bottom w:val="single" w:color="B8C4D2" w:sz="4" w:space="1"/>
-        </w:pBdr>
-        <w:spacing w:after="25" w:before="70"/>
-      </w:pPr>
-      <w:r>
-        <w:rPr>
-          <w:rFonts w:ascii="Calibri" w:cs="Calibri" w:eastAsia="Calibri" w:hAnsi="Calibri"/>
-          <w:b/>
-          <w:bCs/>
-          <w:color w:val="1C4E80"/>
+          <w:color w:val="000000"/>
           <w:sz w:val="19"/>
           <w:szCs w:val="19"/>
         </w:rPr>
@@ -147,25 +147,25 @@
           <w:ilvl w:val="0"/>
           <w:numId w:val="2"/>
         </w:numPr>
-        <w:spacing w:after="25" w:before="0" w:line="238"/>
-      </w:pPr>
-      <w:r>
-        <w:rPr>
-          <w:rFonts w:ascii="Calibri" w:cs="Calibri" w:eastAsia="Calibri" w:hAnsi="Calibri"/>
+        <w:spacing w:after="25" w:before="0" w:line="234"/>
+      </w:pPr>
+      <w:r>
+        <w:rPr>
+          <w:rFonts w:ascii="Times New Roman" w:cs="Times New Roman" w:eastAsia="Times New Roman" w:hAnsi="Times New Roman"/>
           <w:b/>
           <w:bCs/>
-          <w:color w:val="1A1A1A"/>
-          <w:sz w:val="19"/>
-          <w:szCs w:val="19"/>
+          <w:color w:val="000000"/>
+          <w:sz w:val="20"/>
+          <w:szCs w:val="20"/>
         </w:rPr>
         <w:t xml:space="preserve">Size: </w:t>
       </w:r>
       <w:r>
         <w:rPr>
-          <w:rFonts w:ascii="Calibri" w:cs="Calibri" w:eastAsia="Calibri" w:hAnsi="Calibri"/>
-          <w:color w:val="1A1A1A"/>
-          <w:sz w:val="19"/>
-          <w:szCs w:val="19"/>
+          <w:rFonts w:ascii="Times New Roman" w:cs="Times New Roman" w:eastAsia="Times New Roman" w:hAnsi="Times New Roman"/>
+          <w:color w:val="000000"/>
+          <w:sz w:val="20"/>
+          <w:szCs w:val="20"/>
         </w:rPr>
         <w:t xml:space="preserve">55 nodes, 78 edges (59 interdictable), vs. 70 and 125 for Ukraine; loads into env_TA.py unchanged (Figure 1).</w:t>
       </w:r>
@@ -177,25 +177,25 @@
           <w:ilvl w:val="0"/>
           <w:numId w:val="2"/>
         </w:numPr>
-        <w:spacing w:after="25" w:before="0" w:line="238"/>
-      </w:pPr>
-      <w:r>
-        <w:rPr>
-          <w:rFonts w:ascii="Calibri" w:cs="Calibri" w:eastAsia="Calibri" w:hAnsi="Calibri"/>
+        <w:spacing w:after="25" w:before="0" w:line="234"/>
+      </w:pPr>
+      <w:r>
+        <w:rPr>
+          <w:rFonts w:ascii="Times New Roman" w:cs="Times New Roman" w:eastAsia="Times New Roman" w:hAnsi="Times New Roman"/>
           <w:b/>
           <w:bCs/>
-          <w:color w:val="1A1A1A"/>
-          <w:sz w:val="19"/>
-          <w:szCs w:val="19"/>
+          <w:color w:val="000000"/>
+          <w:sz w:val="20"/>
+          <w:szCs w:val="20"/>
         </w:rPr>
         <w:t xml:space="preserve">Sources and sinks: </w:t>
       </w:r>
       <w:r>
         <w:rPr>
-          <w:rFonts w:ascii="Calibri" w:cs="Calibri" w:eastAsia="Calibri" w:hAnsi="Calibri"/>
-          <w:color w:val="1A1A1A"/>
-          <w:sz w:val="19"/>
-          <w:szCs w:val="19"/>
+          <w:rFonts w:ascii="Times New Roman" w:cs="Times New Roman" w:eastAsia="Times New Roman" w:hAnsi="Times New Roman"/>
+          <w:color w:val="000000"/>
+          <w:sz w:val="20"/>
+          <w:szCs w:val="20"/>
         </w:rPr>
         <w:t xml:space="preserve">four origin regions weighted by EIA import shares; three ports by refinery capacity (Kaohsiung 670, Mailiao 540, Shalung 200 kb/d). Demand: 11.9 VLCC loads a month (783 kb/d ÷ 2 million barrels a load).</w:t>
       </w:r>
@@ -207,25 +207,25 @@
           <w:ilvl w:val="0"/>
           <w:numId w:val="2"/>
         </w:numPr>
-        <w:spacing w:after="25" w:before="0" w:line="238"/>
-      </w:pPr>
-      <w:r>
-        <w:rPr>
-          <w:rFonts w:ascii="Calibri" w:cs="Calibri" w:eastAsia="Calibri" w:hAnsi="Calibri"/>
+        <w:spacing w:after="25" w:before="0" w:line="234"/>
+      </w:pPr>
+      <w:r>
+        <w:rPr>
+          <w:rFonts w:ascii="Times New Roman" w:cs="Times New Roman" w:eastAsia="Times New Roman" w:hAnsi="Times New Roman"/>
           <w:b/>
           <w:bCs/>
-          <w:color w:val="1A1A1A"/>
-          <w:sz w:val="19"/>
-          <w:szCs w:val="19"/>
+          <w:color w:val="000000"/>
+          <w:sz w:val="20"/>
+          <w:szCs w:val="20"/>
         </w:rPr>
         <w:t xml:space="preserve">Structure: </w:t>
       </w:r>
       <w:r>
         <w:rPr>
-          <w:rFonts w:ascii="Calibri" w:cs="Calibri" w:eastAsia="Calibri" w:hAnsi="Calibri"/>
-          <w:color w:val="1A1A1A"/>
-          <w:sz w:val="19"/>
-          <w:szCs w:val="19"/>
+          <w:rFonts w:ascii="Times New Roman" w:cs="Times New Roman" w:eastAsia="Times New Roman" w:hAnsi="Times New Roman"/>
+          <w:color w:val="000000"/>
+          <w:sz w:val="20"/>
+          <w:szCs w:val="20"/>
         </w:rPr>
         <w:t xml:space="preserve">each strait or canal is an edge from entrance to exit; a node at every junction; every interdictable lane has a checked alternative (for Hormuz, the two bypass pipelines).</w:t>
       </w:r>
@@ -237,66 +237,66 @@
           <w:ilvl w:val="0"/>
           <w:numId w:val="2"/>
         </w:numPr>
-        <w:spacing w:after="25" w:before="0" w:line="238"/>
-      </w:pPr>
-      <w:r>
-        <w:rPr>
-          <w:rFonts w:ascii="Calibri" w:cs="Calibri" w:eastAsia="Calibri" w:hAnsi="Calibri"/>
+        <w:spacing w:after="25" w:before="0" w:line="234"/>
+      </w:pPr>
+      <w:r>
+        <w:rPr>
+          <w:rFonts w:ascii="Times New Roman" w:cs="Times New Roman" w:eastAsia="Times New Roman" w:hAnsi="Times New Roman"/>
           <w:b/>
           <w:bCs/>
-          <w:color w:val="1A1A1A"/>
+          <w:color w:val="000000"/>
+          <w:sz w:val="20"/>
+          <w:szCs w:val="20"/>
+        </w:rPr>
+        <w:t xml:space="preserve">Geometry: </w:t>
+      </w:r>
+      <w:r>
+        <w:rPr>
+          <w:rFonts w:ascii="Times New Roman" w:cs="Times New Roman" w:eastAsia="Times New Roman" w:hAnsi="Times New Roman"/>
+          <w:color w:val="000000"/>
+          <w:sz w:val="20"/>
+          <w:szCs w:val="20"/>
+        </w:rPr>
+        <w:t xml:space="preserve">real sea lanes (scgraph marnet); 12 nm offshore near Taiwan, the territorial-sea limit; no lane crosses land (Figure 2).</w:t>
+      </w:r>
+    </w:p>
+    <w:p>
+      <w:pPr>
+        <w:keepNext/>
+        <w:pBdr>
+          <w:bottom w:val="single" w:color="000000" w:sz="4" w:space="1"/>
+        </w:pBdr>
+        <w:spacing w:after="25" w:before="70"/>
+      </w:pPr>
+      <w:r>
+        <w:rPr>
+          <w:rFonts w:ascii="Times New Roman" w:cs="Times New Roman" w:eastAsia="Times New Roman" w:hAnsi="Times New Roman"/>
+          <w:b/>
+          <w:bCs/>
+          <w:color w:val="000000"/>
           <w:sz w:val="19"/>
           <w:szCs w:val="19"/>
         </w:rPr>
-        <w:t xml:space="preserve">Geometry: </w:t>
-      </w:r>
-      <w:r>
-        <w:rPr>
-          <w:rFonts w:ascii="Calibri" w:cs="Calibri" w:eastAsia="Calibri" w:hAnsi="Calibri"/>
-          <w:color w:val="1A1A1A"/>
-          <w:sz w:val="19"/>
-          <w:szCs w:val="19"/>
-        </w:rPr>
-        <w:t xml:space="preserve">real sea lanes (scgraph marnet); 12 nm offshore near Taiwan, the territorial-sea limit; no lane crosses land (Figure 2).</w:t>
-      </w:r>
-    </w:p>
-    <w:p>
-      <w:pPr>
-        <w:keepNext/>
-        <w:pBdr>
-          <w:bottom w:val="single" w:color="B8C4D2" w:sz="4" w:space="1"/>
-        </w:pBdr>
-        <w:spacing w:after="25" w:before="70"/>
-      </w:pPr>
-      <w:r>
-        <w:rPr>
-          <w:rFonts w:ascii="Calibri" w:cs="Calibri" w:eastAsia="Calibri" w:hAnsi="Calibri"/>
-          <w:b/>
-          <w:bCs/>
-          <w:color w:val="1C4E80"/>
-          <w:sz w:val="19"/>
-          <w:szCs w:val="19"/>
-        </w:rPr>
         <w:t xml:space="preserve">HOW INTERDICTION WORKS</w:t>
       </w:r>
     </w:p>
     <w:p>
       <w:pPr>
-        <w:spacing w:after="60" w:before="0" w:line="238"/>
-      </w:pPr>
-      <w:r>
-        <w:rPr>
-          <w:rFonts w:ascii="Calibri" w:cs="Calibri" w:eastAsia="Calibri" w:hAnsi="Calibri"/>
-          <w:color w:val="1A1A1A"/>
-          <w:sz w:val="19"/>
-          <w:szCs w:val="19"/>
+        <w:spacing w:after="60" w:before="0" w:line="234"/>
+      </w:pPr>
+      <w:r>
+        <w:rPr>
+          <w:rFonts w:ascii="Times New Roman" w:cs="Times New Roman" w:eastAsia="Times New Roman" w:hAnsi="Times New Roman"/>
+          <w:color w:val="000000"/>
+          <w:sz w:val="20"/>
+          <w:szCs w:val="20"/>
         </w:rPr>
         <w:t xml:space="preserve">The attacker spends one effort budget. Each edge carries the one action that fits where it is, with an effort cost and a probability p that it shuts the edge (the expected share of the month closed), which is the per-edge cost and probability env_TA.py already uses. p is anchored on real disruptions; costs are ordinal, by legal threshold and distance from PRC bases.</w:t>
       </w:r>
     </w:p>
     <w:tbl>
       <w:tblPr>
-        <w:tblW w:type="dxa" w:w="10512"/>
+        <w:tblW w:type="dxa" w:w="10656"/>
         <w:tblBorders>
           <w:top w:val="single" w:color="auto" w:sz="4"/>
           <w:left w:val="single" w:color="auto" w:sz="4"/>
@@ -323,12 +323,11 @@
           <w:tcPr>
             <w:tcW w:type="dxa" w:w="1950"/>
             <w:tcBorders>
-              <w:top w:val="single" w:color="D0D6DE" w:sz="2"/>
-              <w:left w:val="single" w:color="D0D6DE" w:sz="2"/>
-              <w:bottom w:val="single" w:color="D0D6DE" w:sz="2"/>
-              <w:right w:val="single" w:color="D0D6DE" w:sz="2"/>
-            </w:tcBorders>
-            <w:shd w:fill="E6ECF3" w:color="auto" w:val="clear"/>
+              <w:top w:val="single" w:color="000000" w:sz="2"/>
+              <w:left w:val="single" w:color="000000" w:sz="2"/>
+              <w:bottom w:val="single" w:color="000000" w:sz="2"/>
+              <w:right w:val="single" w:color="000000" w:sz="2"/>
+            </w:tcBorders>
             <w:tcMar>
               <w:top w:type="dxa" w:w="25"/>
               <w:left w:type="dxa" w:w="70"/>
@@ -343,10 +342,10 @@
             </w:pPr>
             <w:r>
               <w:rPr>
-                <w:rFonts w:ascii="Calibri" w:cs="Calibri" w:eastAsia="Calibri" w:hAnsi="Calibri"/>
+                <w:rFonts w:ascii="Times New Roman" w:cs="Times New Roman" w:eastAsia="Times New Roman" w:hAnsi="Times New Roman"/>
                 <w:b/>
                 <w:bCs/>
-                <w:color w:val="1C4E80"/>
+                <w:color w:val="000000"/>
                 <w:sz w:val="17"/>
                 <w:szCs w:val="17"/>
               </w:rPr>
@@ -358,12 +357,11 @@
           <w:tcPr>
             <w:tcW w:type="dxa" w:w="3400"/>
             <w:tcBorders>
-              <w:top w:val="single" w:color="D0D6DE" w:sz="2"/>
-              <w:left w:val="single" w:color="D0D6DE" w:sz="2"/>
-              <w:bottom w:val="single" w:color="D0D6DE" w:sz="2"/>
-              <w:right w:val="single" w:color="D0D6DE" w:sz="2"/>
-            </w:tcBorders>
-            <w:shd w:fill="E6ECF3" w:color="auto" w:val="clear"/>
+              <w:top w:val="single" w:color="000000" w:sz="2"/>
+              <w:left w:val="single" w:color="000000" w:sz="2"/>
+              <w:bottom w:val="single" w:color="000000" w:sz="2"/>
+              <w:right w:val="single" w:color="000000" w:sz="2"/>
+            </w:tcBorders>
             <w:tcMar>
               <w:top w:type="dxa" w:w="25"/>
               <w:left w:type="dxa" w:w="70"/>
@@ -378,10 +376,10 @@
             </w:pPr>
             <w:r>
               <w:rPr>
-                <w:rFonts w:ascii="Calibri" w:cs="Calibri" w:eastAsia="Calibri" w:hAnsi="Calibri"/>
+                <w:rFonts w:ascii="Times New Roman" w:cs="Times New Roman" w:eastAsia="Times New Roman" w:hAnsi="Times New Roman"/>
                 <w:b/>
                 <w:bCs/>
-                <w:color w:val="1C4E80"/>
+                <w:color w:val="000000"/>
                 <w:sz w:val="17"/>
                 <w:szCs w:val="17"/>
               </w:rPr>
@@ -393,12 +391,11 @@
           <w:tcPr>
             <w:tcW w:type="dxa" w:w="520"/>
             <w:tcBorders>
-              <w:top w:val="single" w:color="D0D6DE" w:sz="2"/>
-              <w:left w:val="single" w:color="D0D6DE" w:sz="2"/>
-              <w:bottom w:val="single" w:color="D0D6DE" w:sz="2"/>
-              <w:right w:val="single" w:color="D0D6DE" w:sz="2"/>
-            </w:tcBorders>
-            <w:shd w:fill="E6ECF3" w:color="auto" w:val="clear"/>
+              <w:top w:val="single" w:color="000000" w:sz="2"/>
+              <w:left w:val="single" w:color="000000" w:sz="2"/>
+              <w:bottom w:val="single" w:color="000000" w:sz="2"/>
+              <w:right w:val="single" w:color="000000" w:sz="2"/>
+            </w:tcBorders>
             <w:tcMar>
               <w:top w:type="dxa" w:w="25"/>
               <w:left w:type="dxa" w:w="70"/>
@@ -413,10 +410,10 @@
             </w:pPr>
             <w:r>
               <w:rPr>
-                <w:rFonts w:ascii="Calibri" w:cs="Calibri" w:eastAsia="Calibri" w:hAnsi="Calibri"/>
+                <w:rFonts w:ascii="Times New Roman" w:cs="Times New Roman" w:eastAsia="Times New Roman" w:hAnsi="Times New Roman"/>
                 <w:b/>
                 <w:bCs/>
-                <w:color w:val="1C4E80"/>
+                <w:color w:val="000000"/>
                 <w:sz w:val="17"/>
                 <w:szCs w:val="17"/>
               </w:rPr>
@@ -428,12 +425,11 @@
           <w:tcPr>
             <w:tcW w:type="dxa" w:w="900"/>
             <w:tcBorders>
-              <w:top w:val="single" w:color="D0D6DE" w:sz="2"/>
-              <w:left w:val="single" w:color="D0D6DE" w:sz="2"/>
-              <w:bottom w:val="single" w:color="D0D6DE" w:sz="2"/>
-              <w:right w:val="single" w:color="D0D6DE" w:sz="2"/>
-            </w:tcBorders>
-            <w:shd w:fill="E6ECF3" w:color="auto" w:val="clear"/>
+              <w:top w:val="single" w:color="000000" w:sz="2"/>
+              <w:left w:val="single" w:color="000000" w:sz="2"/>
+              <w:bottom w:val="single" w:color="000000" w:sz="2"/>
+              <w:right w:val="single" w:color="000000" w:sz="2"/>
+            </w:tcBorders>
             <w:tcMar>
               <w:top w:type="dxa" w:w="25"/>
               <w:left w:type="dxa" w:w="70"/>
@@ -448,10 +444,10 @@
             </w:pPr>
             <w:r>
               <w:rPr>
-                <w:rFonts w:ascii="Calibri" w:cs="Calibri" w:eastAsia="Calibri" w:hAnsi="Calibri"/>
+                <w:rFonts w:ascii="Times New Roman" w:cs="Times New Roman" w:eastAsia="Times New Roman" w:hAnsi="Times New Roman"/>
                 <w:b/>
                 <w:bCs/>
-                <w:color w:val="1C4E80"/>
+                <w:color w:val="000000"/>
                 <w:sz w:val="17"/>
                 <w:szCs w:val="17"/>
               </w:rPr>
@@ -463,12 +459,11 @@
           <w:tcPr>
             <w:tcW w:type="dxa" w:w="3742"/>
             <w:tcBorders>
-              <w:top w:val="single" w:color="D0D6DE" w:sz="2"/>
-              <w:left w:val="single" w:color="D0D6DE" w:sz="2"/>
-              <w:bottom w:val="single" w:color="D0D6DE" w:sz="2"/>
-              <w:right w:val="single" w:color="D0D6DE" w:sz="2"/>
-            </w:tcBorders>
-            <w:shd w:fill="E6ECF3" w:color="auto" w:val="clear"/>
+              <w:top w:val="single" w:color="000000" w:sz="2"/>
+              <w:left w:val="single" w:color="000000" w:sz="2"/>
+              <w:bottom w:val="single" w:color="000000" w:sz="2"/>
+              <w:right w:val="single" w:color="000000" w:sz="2"/>
+            </w:tcBorders>
             <w:tcMar>
               <w:top w:type="dxa" w:w="25"/>
               <w:left w:type="dxa" w:w="70"/>
@@ -483,10 +478,10 @@
             </w:pPr>
             <w:r>
               <w:rPr>
-                <w:rFonts w:ascii="Calibri" w:cs="Calibri" w:eastAsia="Calibri" w:hAnsi="Calibri"/>
+                <w:rFonts w:ascii="Times New Roman" w:cs="Times New Roman" w:eastAsia="Times New Roman" w:hAnsi="Times New Roman"/>
                 <w:b/>
                 <w:bCs/>
-                <w:color w:val="1C4E80"/>
+                <w:color w:val="000000"/>
                 <w:sz w:val="17"/>
                 <w:szCs w:val="17"/>
               </w:rPr>
@@ -504,10 +499,10 @@
           <w:tcPr>
             <w:tcW w:type="dxa" w:w="1950"/>
             <w:tcBorders>
-              <w:top w:val="single" w:color="D0D6DE" w:sz="2"/>
-              <w:left w:val="single" w:color="D0D6DE" w:sz="2"/>
-              <w:bottom w:val="single" w:color="D0D6DE" w:sz="2"/>
-              <w:right w:val="single" w:color="D0D6DE" w:sz="2"/>
+              <w:top w:val="single" w:color="000000" w:sz="2"/>
+              <w:left w:val="single" w:color="000000" w:sz="2"/>
+              <w:bottom w:val="single" w:color="000000" w:sz="2"/>
+              <w:right w:val="single" w:color="000000" w:sz="2"/>
             </w:tcBorders>
             <w:tcMar>
               <w:top w:type="dxa" w:w="25"/>
@@ -523,8 +518,8 @@
             </w:pPr>
             <w:r>
               <w:rPr>
-                <w:rFonts w:ascii="Calibri" w:cs="Calibri" w:eastAsia="Calibri" w:hAnsi="Calibri"/>
-                <w:color w:val="1A1A1A"/>
+                <w:rFonts w:ascii="Times New Roman" w:cs="Times New Roman" w:eastAsia="Times New Roman" w:hAnsi="Times New Roman"/>
+                <w:color w:val="000000"/>
                 <w:sz w:val="17"/>
                 <w:szCs w:val="17"/>
               </w:rPr>
@@ -536,10 +531,10 @@
           <w:tcPr>
             <w:tcW w:type="dxa" w:w="3400"/>
             <w:tcBorders>
-              <w:top w:val="single" w:color="D0D6DE" w:sz="2"/>
-              <w:left w:val="single" w:color="D0D6DE" w:sz="2"/>
-              <w:bottom w:val="single" w:color="D0D6DE" w:sz="2"/>
-              <w:right w:val="single" w:color="D0D6DE" w:sz="2"/>
+              <w:top w:val="single" w:color="000000" w:sz="2"/>
+              <w:left w:val="single" w:color="000000" w:sz="2"/>
+              <w:bottom w:val="single" w:color="000000" w:sz="2"/>
+              <w:right w:val="single" w:color="000000" w:sz="2"/>
             </w:tcBorders>
             <w:tcMar>
               <w:top w:type="dxa" w:w="25"/>
@@ -555,8 +550,8 @@
             </w:pPr>
             <w:r>
               <w:rPr>
-                <w:rFonts w:ascii="Calibri" w:cs="Calibri" w:eastAsia="Calibri" w:hAnsi="Calibri"/>
-                <w:color w:val="1A1A1A"/>
+                <w:rFonts w:ascii="Times New Roman" w:cs="Times New Roman" w:eastAsia="Times New Roman" w:hAnsi="Times New Roman"/>
+                <w:color w:val="000000"/>
                 <w:sz w:val="17"/>
                 <w:szCs w:val="17"/>
               </w:rPr>
@@ -568,10 +563,10 @@
           <w:tcPr>
             <w:tcW w:type="dxa" w:w="520"/>
             <w:tcBorders>
-              <w:top w:val="single" w:color="D0D6DE" w:sz="2"/>
-              <w:left w:val="single" w:color="D0D6DE" w:sz="2"/>
-              <w:bottom w:val="single" w:color="D0D6DE" w:sz="2"/>
-              <w:right w:val="single" w:color="D0D6DE" w:sz="2"/>
+              <w:top w:val="single" w:color="000000" w:sz="2"/>
+              <w:left w:val="single" w:color="000000" w:sz="2"/>
+              <w:bottom w:val="single" w:color="000000" w:sz="2"/>
+              <w:right w:val="single" w:color="000000" w:sz="2"/>
             </w:tcBorders>
             <w:tcMar>
               <w:top w:type="dxa" w:w="25"/>
@@ -587,8 +582,8 @@
             </w:pPr>
             <w:r>
               <w:rPr>
-                <w:rFonts w:ascii="Calibri" w:cs="Calibri" w:eastAsia="Calibri" w:hAnsi="Calibri"/>
-                <w:color w:val="1A1A1A"/>
+                <w:rFonts w:ascii="Times New Roman" w:cs="Times New Roman" w:eastAsia="Times New Roman" w:hAnsi="Times New Roman"/>
+                <w:color w:val="000000"/>
                 <w:sz w:val="17"/>
                 <w:szCs w:val="17"/>
               </w:rPr>
@@ -600,10 +595,10 @@
           <w:tcPr>
             <w:tcW w:type="dxa" w:w="900"/>
             <w:tcBorders>
-              <w:top w:val="single" w:color="D0D6DE" w:sz="2"/>
-              <w:left w:val="single" w:color="D0D6DE" w:sz="2"/>
-              <w:bottom w:val="single" w:color="D0D6DE" w:sz="2"/>
-              <w:right w:val="single" w:color="D0D6DE" w:sz="2"/>
+              <w:top w:val="single" w:color="000000" w:sz="2"/>
+              <w:left w:val="single" w:color="000000" w:sz="2"/>
+              <w:bottom w:val="single" w:color="000000" w:sz="2"/>
+              <w:right w:val="single" w:color="000000" w:sz="2"/>
             </w:tcBorders>
             <w:tcMar>
               <w:top w:type="dxa" w:w="25"/>
@@ -619,8 +614,8 @@
             </w:pPr>
             <w:r>
               <w:rPr>
-                <w:rFonts w:ascii="Calibri" w:cs="Calibri" w:eastAsia="Calibri" w:hAnsi="Calibri"/>
-                <w:color w:val="1A1A1A"/>
+                <w:rFonts w:ascii="Times New Roman" w:cs="Times New Roman" w:eastAsia="Times New Roman" w:hAnsi="Times New Roman"/>
+                <w:color w:val="000000"/>
                 <w:sz w:val="17"/>
                 <w:szCs w:val="17"/>
               </w:rPr>
@@ -632,10 +627,10 @@
           <w:tcPr>
             <w:tcW w:type="dxa" w:w="3742"/>
             <w:tcBorders>
-              <w:top w:val="single" w:color="D0D6DE" w:sz="2"/>
-              <w:left w:val="single" w:color="D0D6DE" w:sz="2"/>
-              <w:bottom w:val="single" w:color="D0D6DE" w:sz="2"/>
-              <w:right w:val="single" w:color="D0D6DE" w:sz="2"/>
+              <w:top w:val="single" w:color="000000" w:sz="2"/>
+              <w:left w:val="single" w:color="000000" w:sz="2"/>
+              <w:bottom w:val="single" w:color="000000" w:sz="2"/>
+              <w:right w:val="single" w:color="000000" w:sz="2"/>
             </w:tcBorders>
             <w:tcMar>
               <w:top w:type="dxa" w:w="25"/>
@@ -651,8 +646,8 @@
             </w:pPr>
             <w:r>
               <w:rPr>
-                <w:rFonts w:ascii="Calibri" w:cs="Calibri" w:eastAsia="Calibri" w:hAnsi="Calibri"/>
-                <w:color w:val="1A1A1A"/>
+                <w:rFonts w:ascii="Times New Roman" w:cs="Times New Roman" w:eastAsia="Times New Roman" w:hAnsi="Times New Roman"/>
+                <w:color w:val="000000"/>
                 <w:sz w:val="17"/>
                 <w:szCs w:val="17"/>
               </w:rPr>
@@ -670,10 +665,10 @@
           <w:tcPr>
             <w:tcW w:type="dxa" w:w="1950"/>
             <w:tcBorders>
-              <w:top w:val="single" w:color="D0D6DE" w:sz="2"/>
-              <w:left w:val="single" w:color="D0D6DE" w:sz="2"/>
-              <w:bottom w:val="single" w:color="D0D6DE" w:sz="2"/>
-              <w:right w:val="single" w:color="D0D6DE" w:sz="2"/>
+              <w:top w:val="single" w:color="000000" w:sz="2"/>
+              <w:left w:val="single" w:color="000000" w:sz="2"/>
+              <w:bottom w:val="single" w:color="000000" w:sz="2"/>
+              <w:right w:val="single" w:color="000000" w:sz="2"/>
             </w:tcBorders>
             <w:tcMar>
               <w:top w:type="dxa" w:w="25"/>
@@ -689,8 +684,8 @@
             </w:pPr>
             <w:r>
               <w:rPr>
-                <w:rFonts w:ascii="Calibri" w:cs="Calibri" w:eastAsia="Calibri" w:hAnsi="Calibri"/>
-                <w:color w:val="1A1A1A"/>
+                <w:rFonts w:ascii="Times New Roman" w:cs="Times New Roman" w:eastAsia="Times New Roman" w:hAnsi="Times New Roman"/>
+                <w:color w:val="000000"/>
                 <w:sz w:val="17"/>
                 <w:szCs w:val="17"/>
               </w:rPr>
@@ -702,10 +697,10 @@
           <w:tcPr>
             <w:tcW w:type="dxa" w:w="3400"/>
             <w:tcBorders>
-              <w:top w:val="single" w:color="D0D6DE" w:sz="2"/>
-              <w:left w:val="single" w:color="D0D6DE" w:sz="2"/>
-              <w:bottom w:val="single" w:color="D0D6DE" w:sz="2"/>
-              <w:right w:val="single" w:color="D0D6DE" w:sz="2"/>
+              <w:top w:val="single" w:color="000000" w:sz="2"/>
+              <w:left w:val="single" w:color="000000" w:sz="2"/>
+              <w:bottom w:val="single" w:color="000000" w:sz="2"/>
+              <w:right w:val="single" w:color="000000" w:sz="2"/>
             </w:tcBorders>
             <w:tcMar>
               <w:top w:type="dxa" w:w="25"/>
@@ -721,8 +716,8 @@
             </w:pPr>
             <w:r>
               <w:rPr>
-                <w:rFonts w:ascii="Calibri" w:cs="Calibri" w:eastAsia="Calibri" w:hAnsi="Calibri"/>
-                <w:color w:val="1A1A1A"/>
+                <w:rFonts w:ascii="Times New Roman" w:cs="Times New Roman" w:eastAsia="Times New Roman" w:hAnsi="Times New Roman"/>
+                <w:color w:val="000000"/>
                 <w:sz w:val="17"/>
                 <w:szCs w:val="17"/>
               </w:rPr>
@@ -734,10 +729,10 @@
           <w:tcPr>
             <w:tcW w:type="dxa" w:w="520"/>
             <w:tcBorders>
-              <w:top w:val="single" w:color="D0D6DE" w:sz="2"/>
-              <w:left w:val="single" w:color="D0D6DE" w:sz="2"/>
-              <w:bottom w:val="single" w:color="D0D6DE" w:sz="2"/>
-              <w:right w:val="single" w:color="D0D6DE" w:sz="2"/>
+              <w:top w:val="single" w:color="000000" w:sz="2"/>
+              <w:left w:val="single" w:color="000000" w:sz="2"/>
+              <w:bottom w:val="single" w:color="000000" w:sz="2"/>
+              <w:right w:val="single" w:color="000000" w:sz="2"/>
             </w:tcBorders>
             <w:tcMar>
               <w:top w:type="dxa" w:w="25"/>
@@ -753,8 +748,8 @@
             </w:pPr>
             <w:r>
               <w:rPr>
-                <w:rFonts w:ascii="Calibri" w:cs="Calibri" w:eastAsia="Calibri" w:hAnsi="Calibri"/>
-                <w:color w:val="1A1A1A"/>
+                <w:rFonts w:ascii="Times New Roman" w:cs="Times New Roman" w:eastAsia="Times New Roman" w:hAnsi="Times New Roman"/>
+                <w:color w:val="000000"/>
                 <w:sz w:val="17"/>
                 <w:szCs w:val="17"/>
               </w:rPr>
@@ -766,10 +761,10 @@
           <w:tcPr>
             <w:tcW w:type="dxa" w:w="900"/>
             <w:tcBorders>
-              <w:top w:val="single" w:color="D0D6DE" w:sz="2"/>
-              <w:left w:val="single" w:color="D0D6DE" w:sz="2"/>
-              <w:bottom w:val="single" w:color="D0D6DE" w:sz="2"/>
-              <w:right w:val="single" w:color="D0D6DE" w:sz="2"/>
+              <w:top w:val="single" w:color="000000" w:sz="2"/>
+              <w:left w:val="single" w:color="000000" w:sz="2"/>
+              <w:bottom w:val="single" w:color="000000" w:sz="2"/>
+              <w:right w:val="single" w:color="000000" w:sz="2"/>
             </w:tcBorders>
             <w:tcMar>
               <w:top w:type="dxa" w:w="25"/>
@@ -785,8 +780,8 @@
             </w:pPr>
             <w:r>
               <w:rPr>
-                <w:rFonts w:ascii="Calibri" w:cs="Calibri" w:eastAsia="Calibri" w:hAnsi="Calibri"/>
-                <w:color w:val="1A1A1A"/>
+                <w:rFonts w:ascii="Times New Roman" w:cs="Times New Roman" w:eastAsia="Times New Roman" w:hAnsi="Times New Roman"/>
+                <w:color w:val="000000"/>
                 <w:sz w:val="17"/>
                 <w:szCs w:val="17"/>
               </w:rPr>
@@ -798,10 +793,10 @@
           <w:tcPr>
             <w:tcW w:type="dxa" w:w="3742"/>
             <w:tcBorders>
-              <w:top w:val="single" w:color="D0D6DE" w:sz="2"/>
-              <w:left w:val="single" w:color="D0D6DE" w:sz="2"/>
-              <w:bottom w:val="single" w:color="D0D6DE" w:sz="2"/>
-              <w:right w:val="single" w:color="D0D6DE" w:sz="2"/>
+              <w:top w:val="single" w:color="000000" w:sz="2"/>
+              <w:left w:val="single" w:color="000000" w:sz="2"/>
+              <w:bottom w:val="single" w:color="000000" w:sz="2"/>
+              <w:right w:val="single" w:color="000000" w:sz="2"/>
             </w:tcBorders>
             <w:tcMar>
               <w:top w:type="dxa" w:w="25"/>
@@ -817,8 +812,8 @@
             </w:pPr>
             <w:r>
               <w:rPr>
-                <w:rFonts w:ascii="Calibri" w:cs="Calibri" w:eastAsia="Calibri" w:hAnsi="Calibri"/>
-                <w:color w:val="1A1A1A"/>
+                <w:rFonts w:ascii="Times New Roman" w:cs="Times New Roman" w:eastAsia="Times New Roman" w:hAnsi="Times New Roman"/>
+                <w:color w:val="000000"/>
                 <w:sz w:val="17"/>
                 <w:szCs w:val="17"/>
               </w:rPr>
@@ -836,10 +831,10 @@
           <w:tcPr>
             <w:tcW w:type="dxa" w:w="1950"/>
             <w:tcBorders>
-              <w:top w:val="single" w:color="D0D6DE" w:sz="2"/>
-              <w:left w:val="single" w:color="D0D6DE" w:sz="2"/>
-              <w:bottom w:val="single" w:color="D0D6DE" w:sz="2"/>
-              <w:right w:val="single" w:color="D0D6DE" w:sz="2"/>
+              <w:top w:val="single" w:color="000000" w:sz="2"/>
+              <w:left w:val="single" w:color="000000" w:sz="2"/>
+              <w:bottom w:val="single" w:color="000000" w:sz="2"/>
+              <w:right w:val="single" w:color="000000" w:sz="2"/>
             </w:tcBorders>
             <w:tcMar>
               <w:top w:type="dxa" w:w="25"/>
@@ -855,8 +850,8 @@
             </w:pPr>
             <w:r>
               <w:rPr>
-                <w:rFonts w:ascii="Calibri" w:cs="Calibri" w:eastAsia="Calibri" w:hAnsi="Calibri"/>
-                <w:color w:val="1A1A1A"/>
+                <w:rFonts w:ascii="Times New Roman" w:cs="Times New Roman" w:eastAsia="Times New Roman" w:hAnsi="Times New Roman"/>
+                <w:color w:val="000000"/>
                 <w:sz w:val="17"/>
                 <w:szCs w:val="17"/>
               </w:rPr>
@@ -868,10 +863,10 @@
           <w:tcPr>
             <w:tcW w:type="dxa" w:w="3400"/>
             <w:tcBorders>
-              <w:top w:val="single" w:color="D0D6DE" w:sz="2"/>
-              <w:left w:val="single" w:color="D0D6DE" w:sz="2"/>
-              <w:bottom w:val="single" w:color="D0D6DE" w:sz="2"/>
-              <w:right w:val="single" w:color="D0D6DE" w:sz="2"/>
+              <w:top w:val="single" w:color="000000" w:sz="2"/>
+              <w:left w:val="single" w:color="000000" w:sz="2"/>
+              <w:bottom w:val="single" w:color="000000" w:sz="2"/>
+              <w:right w:val="single" w:color="000000" w:sz="2"/>
             </w:tcBorders>
             <w:tcMar>
               <w:top w:type="dxa" w:w="25"/>
@@ -887,8 +882,8 @@
             </w:pPr>
             <w:r>
               <w:rPr>
-                <w:rFonts w:ascii="Calibri" w:cs="Calibri" w:eastAsia="Calibri" w:hAnsi="Calibri"/>
-                <w:color w:val="1A1A1A"/>
+                <w:rFonts w:ascii="Times New Roman" w:cs="Times New Roman" w:eastAsia="Times New Roman" w:hAnsi="Times New Roman"/>
+                <w:color w:val="000000"/>
                 <w:sz w:val="17"/>
                 <w:szCs w:val="17"/>
               </w:rPr>
@@ -900,10 +895,10 @@
           <w:tcPr>
             <w:tcW w:type="dxa" w:w="520"/>
             <w:tcBorders>
-              <w:top w:val="single" w:color="D0D6DE" w:sz="2"/>
-              <w:left w:val="single" w:color="D0D6DE" w:sz="2"/>
-              <w:bottom w:val="single" w:color="D0D6DE" w:sz="2"/>
-              <w:right w:val="single" w:color="D0D6DE" w:sz="2"/>
+              <w:top w:val="single" w:color="000000" w:sz="2"/>
+              <w:left w:val="single" w:color="000000" w:sz="2"/>
+              <w:bottom w:val="single" w:color="000000" w:sz="2"/>
+              <w:right w:val="single" w:color="000000" w:sz="2"/>
             </w:tcBorders>
             <w:tcMar>
               <w:top w:type="dxa" w:w="25"/>
@@ -919,8 +914,8 @@
             </w:pPr>
             <w:r>
               <w:rPr>
-                <w:rFonts w:ascii="Calibri" w:cs="Calibri" w:eastAsia="Calibri" w:hAnsi="Calibri"/>
-                <w:color w:val="1A1A1A"/>
+                <w:rFonts w:ascii="Times New Roman" w:cs="Times New Roman" w:eastAsia="Times New Roman" w:hAnsi="Times New Roman"/>
+                <w:color w:val="000000"/>
                 <w:sz w:val="17"/>
                 <w:szCs w:val="17"/>
               </w:rPr>
@@ -932,10 +927,10 @@
           <w:tcPr>
             <w:tcW w:type="dxa" w:w="900"/>
             <w:tcBorders>
-              <w:top w:val="single" w:color="D0D6DE" w:sz="2"/>
-              <w:left w:val="single" w:color="D0D6DE" w:sz="2"/>
-              <w:bottom w:val="single" w:color="D0D6DE" w:sz="2"/>
-              <w:right w:val="single" w:color="D0D6DE" w:sz="2"/>
+              <w:top w:val="single" w:color="000000" w:sz="2"/>
+              <w:left w:val="single" w:color="000000" w:sz="2"/>
+              <w:bottom w:val="single" w:color="000000" w:sz="2"/>
+              <w:right w:val="single" w:color="000000" w:sz="2"/>
             </w:tcBorders>
             <w:tcMar>
               <w:top w:type="dxa" w:w="25"/>
@@ -951,8 +946,8 @@
             </w:pPr>
             <w:r>
               <w:rPr>
-                <w:rFonts w:ascii="Calibri" w:cs="Calibri" w:eastAsia="Calibri" w:hAnsi="Calibri"/>
-                <w:color w:val="1A1A1A"/>
+                <w:rFonts w:ascii="Times New Roman" w:cs="Times New Roman" w:eastAsia="Times New Roman" w:hAnsi="Times New Roman"/>
+                <w:color w:val="000000"/>
                 <w:sz w:val="17"/>
                 <w:szCs w:val="17"/>
               </w:rPr>
@@ -964,10 +959,10 @@
           <w:tcPr>
             <w:tcW w:type="dxa" w:w="3742"/>
             <w:tcBorders>
-              <w:top w:val="single" w:color="D0D6DE" w:sz="2"/>
-              <w:left w:val="single" w:color="D0D6DE" w:sz="2"/>
-              <w:bottom w:val="single" w:color="D0D6DE" w:sz="2"/>
-              <w:right w:val="single" w:color="D0D6DE" w:sz="2"/>
+              <w:top w:val="single" w:color="000000" w:sz="2"/>
+              <w:left w:val="single" w:color="000000" w:sz="2"/>
+              <w:bottom w:val="single" w:color="000000" w:sz="2"/>
+              <w:right w:val="single" w:color="000000" w:sz="2"/>
             </w:tcBorders>
             <w:tcMar>
               <w:top w:type="dxa" w:w="25"/>
@@ -983,8 +978,8 @@
             </w:pPr>
             <w:r>
               <w:rPr>
-                <w:rFonts w:ascii="Calibri" w:cs="Calibri" w:eastAsia="Calibri" w:hAnsi="Calibri"/>
-                <w:color w:val="1A1A1A"/>
+                <w:rFonts w:ascii="Times New Roman" w:cs="Times New Roman" w:eastAsia="Times New Roman" w:hAnsi="Times New Roman"/>
+                <w:color w:val="000000"/>
                 <w:sz w:val="17"/>
                 <w:szCs w:val="17"/>
               </w:rPr>
@@ -1002,10 +997,10 @@
           <w:tcPr>
             <w:tcW w:type="dxa" w:w="1950"/>
             <w:tcBorders>
-              <w:top w:val="single" w:color="D0D6DE" w:sz="2"/>
-              <w:left w:val="single" w:color="D0D6DE" w:sz="2"/>
-              <w:bottom w:val="single" w:color="D0D6DE" w:sz="2"/>
-              <w:right w:val="single" w:color="D0D6DE" w:sz="2"/>
+              <w:top w:val="single" w:color="000000" w:sz="2"/>
+              <w:left w:val="single" w:color="000000" w:sz="2"/>
+              <w:bottom w:val="single" w:color="000000" w:sz="2"/>
+              <w:right w:val="single" w:color="000000" w:sz="2"/>
             </w:tcBorders>
             <w:tcMar>
               <w:top w:type="dxa" w:w="25"/>
@@ -1021,8 +1016,8 @@
             </w:pPr>
             <w:r>
               <w:rPr>
-                <w:rFonts w:ascii="Calibri" w:cs="Calibri" w:eastAsia="Calibri" w:hAnsi="Calibri"/>
-                <w:color w:val="1A1A1A"/>
+                <w:rFonts w:ascii="Times New Roman" w:cs="Times New Roman" w:eastAsia="Times New Roman" w:hAnsi="Times New Roman"/>
+                <w:color w:val="000000"/>
                 <w:sz w:val="17"/>
                 <w:szCs w:val="17"/>
               </w:rPr>
@@ -1034,10 +1029,10 @@
           <w:tcPr>
             <w:tcW w:type="dxa" w:w="3400"/>
             <w:tcBorders>
-              <w:top w:val="single" w:color="D0D6DE" w:sz="2"/>
-              <w:left w:val="single" w:color="D0D6DE" w:sz="2"/>
-              <w:bottom w:val="single" w:color="D0D6DE" w:sz="2"/>
-              <w:right w:val="single" w:color="D0D6DE" w:sz="2"/>
+              <w:top w:val="single" w:color="000000" w:sz="2"/>
+              <w:left w:val="single" w:color="000000" w:sz="2"/>
+              <w:bottom w:val="single" w:color="000000" w:sz="2"/>
+              <w:right w:val="single" w:color="000000" w:sz="2"/>
             </w:tcBorders>
             <w:tcMar>
               <w:top w:type="dxa" w:w="25"/>
@@ -1053,8 +1048,8 @@
             </w:pPr>
             <w:r>
               <w:rPr>
-                <w:rFonts w:ascii="Calibri" w:cs="Calibri" w:eastAsia="Calibri" w:hAnsi="Calibri"/>
-                <w:color w:val="1A1A1A"/>
+                <w:rFonts w:ascii="Times New Roman" w:cs="Times New Roman" w:eastAsia="Times New Roman" w:hAnsi="Times New Roman"/>
+                <w:color w:val="000000"/>
                 <w:sz w:val="17"/>
                 <w:szCs w:val="17"/>
               </w:rPr>
@@ -1066,10 +1061,10 @@
           <w:tcPr>
             <w:tcW w:type="dxa" w:w="520"/>
             <w:tcBorders>
-              <w:top w:val="single" w:color="D0D6DE" w:sz="2"/>
-              <w:left w:val="single" w:color="D0D6DE" w:sz="2"/>
-              <w:bottom w:val="single" w:color="D0D6DE" w:sz="2"/>
-              <w:right w:val="single" w:color="D0D6DE" w:sz="2"/>
+              <w:top w:val="single" w:color="000000" w:sz="2"/>
+              <w:left w:val="single" w:color="000000" w:sz="2"/>
+              <w:bottom w:val="single" w:color="000000" w:sz="2"/>
+              <w:right w:val="single" w:color="000000" w:sz="2"/>
             </w:tcBorders>
             <w:tcMar>
               <w:top w:type="dxa" w:w="25"/>
@@ -1085,8 +1080,8 @@
             </w:pPr>
             <w:r>
               <w:rPr>
-                <w:rFonts w:ascii="Calibri" w:cs="Calibri" w:eastAsia="Calibri" w:hAnsi="Calibri"/>
-                <w:color w:val="1A1A1A"/>
+                <w:rFonts w:ascii="Times New Roman" w:cs="Times New Roman" w:eastAsia="Times New Roman" w:hAnsi="Times New Roman"/>
+                <w:color w:val="000000"/>
                 <w:sz w:val="17"/>
                 <w:szCs w:val="17"/>
               </w:rPr>
@@ -1098,10 +1093,10 @@
           <w:tcPr>
             <w:tcW w:type="dxa" w:w="900"/>
             <w:tcBorders>
-              <w:top w:val="single" w:color="D0D6DE" w:sz="2"/>
-              <w:left w:val="single" w:color="D0D6DE" w:sz="2"/>
-              <w:bottom w:val="single" w:color="D0D6DE" w:sz="2"/>
-              <w:right w:val="single" w:color="D0D6DE" w:sz="2"/>
+              <w:top w:val="single" w:color="000000" w:sz="2"/>
+              <w:left w:val="single" w:color="000000" w:sz="2"/>
+              <w:bottom w:val="single" w:color="000000" w:sz="2"/>
+              <w:right w:val="single" w:color="000000" w:sz="2"/>
             </w:tcBorders>
             <w:tcMar>
               <w:top w:type="dxa" w:w="25"/>
@@ -1117,8 +1112,8 @@
             </w:pPr>
             <w:r>
               <w:rPr>
-                <w:rFonts w:ascii="Calibri" w:cs="Calibri" w:eastAsia="Calibri" w:hAnsi="Calibri"/>
-                <w:color w:val="1A1A1A"/>
+                <w:rFonts w:ascii="Times New Roman" w:cs="Times New Roman" w:eastAsia="Times New Roman" w:hAnsi="Times New Roman"/>
+                <w:color w:val="000000"/>
                 <w:sz w:val="17"/>
                 <w:szCs w:val="17"/>
               </w:rPr>
@@ -1130,10 +1125,10 @@
           <w:tcPr>
             <w:tcW w:type="dxa" w:w="3742"/>
             <w:tcBorders>
-              <w:top w:val="single" w:color="D0D6DE" w:sz="2"/>
-              <w:left w:val="single" w:color="D0D6DE" w:sz="2"/>
-              <w:bottom w:val="single" w:color="D0D6DE" w:sz="2"/>
-              <w:right w:val="single" w:color="D0D6DE" w:sz="2"/>
+              <w:top w:val="single" w:color="000000" w:sz="2"/>
+              <w:left w:val="single" w:color="000000" w:sz="2"/>
+              <w:bottom w:val="single" w:color="000000" w:sz="2"/>
+              <w:right w:val="single" w:color="000000" w:sz="2"/>
             </w:tcBorders>
             <w:tcMar>
               <w:top w:type="dxa" w:w="25"/>
@@ -1149,8 +1144,8 @@
             </w:pPr>
             <w:r>
               <w:rPr>
-                <w:rFonts w:ascii="Calibri" w:cs="Calibri" w:eastAsia="Calibri" w:hAnsi="Calibri"/>
-                <w:color w:val="1A1A1A"/>
+                <w:rFonts w:ascii="Times New Roman" w:cs="Times New Roman" w:eastAsia="Times New Roman" w:hAnsi="Times New Roman"/>
+                <w:color w:val="000000"/>
                 <w:sz w:val="17"/>
                 <w:szCs w:val="17"/>
               </w:rPr>
@@ -1168,10 +1163,10 @@
           <w:tcPr>
             <w:tcW w:type="dxa" w:w="1950"/>
             <w:tcBorders>
-              <w:top w:val="single" w:color="D0D6DE" w:sz="2"/>
-              <w:left w:val="single" w:color="D0D6DE" w:sz="2"/>
-              <w:bottom w:val="single" w:color="D0D6DE" w:sz="2"/>
-              <w:right w:val="single" w:color="D0D6DE" w:sz="2"/>
+              <w:top w:val="single" w:color="000000" w:sz="2"/>
+              <w:left w:val="single" w:color="000000" w:sz="2"/>
+              <w:bottom w:val="single" w:color="000000" w:sz="2"/>
+              <w:right w:val="single" w:color="000000" w:sz="2"/>
             </w:tcBorders>
             <w:tcMar>
               <w:top w:type="dxa" w:w="25"/>
@@ -1187,8 +1182,8 @@
             </w:pPr>
             <w:r>
               <w:rPr>
-                <w:rFonts w:ascii="Calibri" w:cs="Calibri" w:eastAsia="Calibri" w:hAnsi="Calibri"/>
-                <w:color w:val="1A1A1A"/>
+                <w:rFonts w:ascii="Times New Roman" w:cs="Times New Roman" w:eastAsia="Times New Roman" w:hAnsi="Times New Roman"/>
+                <w:color w:val="000000"/>
                 <w:sz w:val="17"/>
                 <w:szCs w:val="17"/>
               </w:rPr>
@@ -1200,10 +1195,10 @@
           <w:tcPr>
             <w:tcW w:type="dxa" w:w="3400"/>
             <w:tcBorders>
-              <w:top w:val="single" w:color="D0D6DE" w:sz="2"/>
-              <w:left w:val="single" w:color="D0D6DE" w:sz="2"/>
-              <w:bottom w:val="single" w:color="D0D6DE" w:sz="2"/>
-              <w:right w:val="single" w:color="D0D6DE" w:sz="2"/>
+              <w:top w:val="single" w:color="000000" w:sz="2"/>
+              <w:left w:val="single" w:color="000000" w:sz="2"/>
+              <w:bottom w:val="single" w:color="000000" w:sz="2"/>
+              <w:right w:val="single" w:color="000000" w:sz="2"/>
             </w:tcBorders>
             <w:tcMar>
               <w:top w:type="dxa" w:w="25"/>
@@ -1219,8 +1214,8 @@
             </w:pPr>
             <w:r>
               <w:rPr>
-                <w:rFonts w:ascii="Calibri" w:cs="Calibri" w:eastAsia="Calibri" w:hAnsi="Calibri"/>
-                <w:color w:val="1A1A1A"/>
+                <w:rFonts w:ascii="Times New Roman" w:cs="Times New Roman" w:eastAsia="Times New Roman" w:hAnsi="Times New Roman"/>
+                <w:color w:val="000000"/>
                 <w:sz w:val="17"/>
                 <w:szCs w:val="17"/>
               </w:rPr>
@@ -1232,10 +1227,10 @@
           <w:tcPr>
             <w:tcW w:type="dxa" w:w="520"/>
             <w:tcBorders>
-              <w:top w:val="single" w:color="D0D6DE" w:sz="2"/>
-              <w:left w:val="single" w:color="D0D6DE" w:sz="2"/>
-              <w:bottom w:val="single" w:color="D0D6DE" w:sz="2"/>
-              <w:right w:val="single" w:color="D0D6DE" w:sz="2"/>
+              <w:top w:val="single" w:color="000000" w:sz="2"/>
+              <w:left w:val="single" w:color="000000" w:sz="2"/>
+              <w:bottom w:val="single" w:color="000000" w:sz="2"/>
+              <w:right w:val="single" w:color="000000" w:sz="2"/>
             </w:tcBorders>
             <w:tcMar>
               <w:top w:type="dxa" w:w="25"/>
@@ -1251,8 +1246,8 @@
             </w:pPr>
             <w:r>
               <w:rPr>
-                <w:rFonts w:ascii="Calibri" w:cs="Calibri" w:eastAsia="Calibri" w:hAnsi="Calibri"/>
-                <w:color w:val="1A1A1A"/>
+                <w:rFonts w:ascii="Times New Roman" w:cs="Times New Roman" w:eastAsia="Times New Roman" w:hAnsi="Times New Roman"/>
+                <w:color w:val="000000"/>
                 <w:sz w:val="17"/>
                 <w:szCs w:val="17"/>
               </w:rPr>
@@ -1264,10 +1259,10 @@
           <w:tcPr>
             <w:tcW w:type="dxa" w:w="900"/>
             <w:tcBorders>
-              <w:top w:val="single" w:color="D0D6DE" w:sz="2"/>
-              <w:left w:val="single" w:color="D0D6DE" w:sz="2"/>
-              <w:bottom w:val="single" w:color="D0D6DE" w:sz="2"/>
-              <w:right w:val="single" w:color="D0D6DE" w:sz="2"/>
+              <w:top w:val="single" w:color="000000" w:sz="2"/>
+              <w:left w:val="single" w:color="000000" w:sz="2"/>
+              <w:bottom w:val="single" w:color="000000" w:sz="2"/>
+              <w:right w:val="single" w:color="000000" w:sz="2"/>
             </w:tcBorders>
             <w:tcMar>
               <w:top w:type="dxa" w:w="25"/>
@@ -1283,8 +1278,8 @@
             </w:pPr>
             <w:r>
               <w:rPr>
-                <w:rFonts w:ascii="Calibri" w:cs="Calibri" w:eastAsia="Calibri" w:hAnsi="Calibri"/>
-                <w:color w:val="1A1A1A"/>
+                <w:rFonts w:ascii="Times New Roman" w:cs="Times New Roman" w:eastAsia="Times New Roman" w:hAnsi="Times New Roman"/>
+                <w:color w:val="000000"/>
                 <w:sz w:val="17"/>
                 <w:szCs w:val="17"/>
               </w:rPr>
@@ -1296,10 +1291,10 @@
           <w:tcPr>
             <w:tcW w:type="dxa" w:w="3742"/>
             <w:tcBorders>
-              <w:top w:val="single" w:color="D0D6DE" w:sz="2"/>
-              <w:left w:val="single" w:color="D0D6DE" w:sz="2"/>
-              <w:bottom w:val="single" w:color="D0D6DE" w:sz="2"/>
-              <w:right w:val="single" w:color="D0D6DE" w:sz="2"/>
+              <w:top w:val="single" w:color="000000" w:sz="2"/>
+              <w:left w:val="single" w:color="000000" w:sz="2"/>
+              <w:bottom w:val="single" w:color="000000" w:sz="2"/>
+              <w:right w:val="single" w:color="000000" w:sz="2"/>
             </w:tcBorders>
             <w:tcMar>
               <w:top w:type="dxa" w:w="25"/>
@@ -1315,8 +1310,8 @@
             </w:pPr>
             <w:r>
               <w:rPr>
-                <w:rFonts w:ascii="Calibri" w:cs="Calibri" w:eastAsia="Calibri" w:hAnsi="Calibri"/>
-                <w:color w:val="1A1A1A"/>
+                <w:rFonts w:ascii="Times New Roman" w:cs="Times New Roman" w:eastAsia="Times New Roman" w:hAnsi="Times New Roman"/>
+                <w:color w:val="000000"/>
                 <w:sz w:val="17"/>
                 <w:szCs w:val="17"/>
               </w:rPr>
@@ -1334,10 +1329,10 @@
           <w:tcPr>
             <w:tcW w:type="dxa" w:w="1950"/>
             <w:tcBorders>
-              <w:top w:val="single" w:color="D0D6DE" w:sz="2"/>
-              <w:left w:val="single" w:color="D0D6DE" w:sz="2"/>
-              <w:bottom w:val="single" w:color="D0D6DE" w:sz="2"/>
-              <w:right w:val="single" w:color="D0D6DE" w:sz="2"/>
+              <w:top w:val="single" w:color="000000" w:sz="2"/>
+              <w:left w:val="single" w:color="000000" w:sz="2"/>
+              <w:bottom w:val="single" w:color="000000" w:sz="2"/>
+              <w:right w:val="single" w:color="000000" w:sz="2"/>
             </w:tcBorders>
             <w:tcMar>
               <w:top w:type="dxa" w:w="25"/>
@@ -1353,8 +1348,8 @@
             </w:pPr>
             <w:r>
               <w:rPr>
-                <w:rFonts w:ascii="Calibri" w:cs="Calibri" w:eastAsia="Calibri" w:hAnsi="Calibri"/>
-                <w:color w:val="1A1A1A"/>
+                <w:rFonts w:ascii="Times New Roman" w:cs="Times New Roman" w:eastAsia="Times New Roman" w:hAnsi="Times New Roman"/>
+                <w:color w:val="000000"/>
                 <w:sz w:val="17"/>
                 <w:szCs w:val="17"/>
               </w:rPr>
@@ -1366,10 +1361,10 @@
           <w:tcPr>
             <w:tcW w:type="dxa" w:w="3400"/>
             <w:tcBorders>
-              <w:top w:val="single" w:color="D0D6DE" w:sz="2"/>
-              <w:left w:val="single" w:color="D0D6DE" w:sz="2"/>
-              <w:bottom w:val="single" w:color="D0D6DE" w:sz="2"/>
-              <w:right w:val="single" w:color="D0D6DE" w:sz="2"/>
+              <w:top w:val="single" w:color="000000" w:sz="2"/>
+              <w:left w:val="single" w:color="000000" w:sz="2"/>
+              <w:bottom w:val="single" w:color="000000" w:sz="2"/>
+              <w:right w:val="single" w:color="000000" w:sz="2"/>
             </w:tcBorders>
             <w:tcMar>
               <w:top w:type="dxa" w:w="25"/>
@@ -1385,8 +1380,8 @@
             </w:pPr>
             <w:r>
               <w:rPr>
-                <w:rFonts w:ascii="Calibri" w:cs="Calibri" w:eastAsia="Calibri" w:hAnsi="Calibri"/>
-                <w:color w:val="1A1A1A"/>
+                <w:rFonts w:ascii="Times New Roman" w:cs="Times New Roman" w:eastAsia="Times New Roman" w:hAnsi="Times New Roman"/>
+                <w:color w:val="000000"/>
                 <w:sz w:val="17"/>
                 <w:szCs w:val="17"/>
               </w:rPr>
@@ -1398,10 +1393,10 @@
           <w:tcPr>
             <w:tcW w:type="dxa" w:w="520"/>
             <w:tcBorders>
-              <w:top w:val="single" w:color="D0D6DE" w:sz="2"/>
-              <w:left w:val="single" w:color="D0D6DE" w:sz="2"/>
-              <w:bottom w:val="single" w:color="D0D6DE" w:sz="2"/>
-              <w:right w:val="single" w:color="D0D6DE" w:sz="2"/>
+              <w:top w:val="single" w:color="000000" w:sz="2"/>
+              <w:left w:val="single" w:color="000000" w:sz="2"/>
+              <w:bottom w:val="single" w:color="000000" w:sz="2"/>
+              <w:right w:val="single" w:color="000000" w:sz="2"/>
             </w:tcBorders>
             <w:tcMar>
               <w:top w:type="dxa" w:w="25"/>
@@ -1417,8 +1412,8 @@
             </w:pPr>
             <w:r>
               <w:rPr>
-                <w:rFonts w:ascii="Calibri" w:cs="Calibri" w:eastAsia="Calibri" w:hAnsi="Calibri"/>
-                <w:color w:val="1A1A1A"/>
+                <w:rFonts w:ascii="Times New Roman" w:cs="Times New Roman" w:eastAsia="Times New Roman" w:hAnsi="Times New Roman"/>
+                <w:color w:val="000000"/>
                 <w:sz w:val="17"/>
                 <w:szCs w:val="17"/>
               </w:rPr>
@@ -1430,10 +1425,10 @@
           <w:tcPr>
             <w:tcW w:type="dxa" w:w="900"/>
             <w:tcBorders>
-              <w:top w:val="single" w:color="D0D6DE" w:sz="2"/>
-              <w:left w:val="single" w:color="D0D6DE" w:sz="2"/>
-              <w:bottom w:val="single" w:color="D0D6DE" w:sz="2"/>
-              <w:right w:val="single" w:color="D0D6DE" w:sz="2"/>
+              <w:top w:val="single" w:color="000000" w:sz="2"/>
+              <w:left w:val="single" w:color="000000" w:sz="2"/>
+              <w:bottom w:val="single" w:color="000000" w:sz="2"/>
+              <w:right w:val="single" w:color="000000" w:sz="2"/>
             </w:tcBorders>
             <w:tcMar>
               <w:top w:type="dxa" w:w="25"/>
@@ -1449,8 +1444,8 @@
             </w:pPr>
             <w:r>
               <w:rPr>
-                <w:rFonts w:ascii="Calibri" w:cs="Calibri" w:eastAsia="Calibri" w:hAnsi="Calibri"/>
-                <w:color w:val="1A1A1A"/>
+                <w:rFonts w:ascii="Times New Roman" w:cs="Times New Roman" w:eastAsia="Times New Roman" w:hAnsi="Times New Roman"/>
+                <w:color w:val="000000"/>
                 <w:sz w:val="17"/>
                 <w:szCs w:val="17"/>
               </w:rPr>
@@ -1462,10 +1457,10 @@
           <w:tcPr>
             <w:tcW w:type="dxa" w:w="3742"/>
             <w:tcBorders>
-              <w:top w:val="single" w:color="D0D6DE" w:sz="2"/>
-              <w:left w:val="single" w:color="D0D6DE" w:sz="2"/>
-              <w:bottom w:val="single" w:color="D0D6DE" w:sz="2"/>
-              <w:right w:val="single" w:color="D0D6DE" w:sz="2"/>
+              <w:top w:val="single" w:color="000000" w:sz="2"/>
+              <w:left w:val="single" w:color="000000" w:sz="2"/>
+              <w:bottom w:val="single" w:color="000000" w:sz="2"/>
+              <w:right w:val="single" w:color="000000" w:sz="2"/>
             </w:tcBorders>
             <w:tcMar>
               <w:top w:type="dxa" w:w="25"/>
@@ -1481,8 +1476,8 @@
             </w:pPr>
             <w:r>
               <w:rPr>
-                <w:rFonts w:ascii="Calibri" w:cs="Calibri" w:eastAsia="Calibri" w:hAnsi="Calibri"/>
-                <w:color w:val="1A1A1A"/>
+                <w:rFonts w:ascii="Times New Roman" w:cs="Times New Roman" w:eastAsia="Times New Roman" w:hAnsi="Times New Roman"/>
+                <w:color w:val="000000"/>
                 <w:sz w:val="17"/>
                 <w:szCs w:val="17"/>
               </w:rPr>
@@ -1500,10 +1495,10 @@
           <w:tcPr>
             <w:tcW w:type="dxa" w:w="1950"/>
             <w:tcBorders>
-              <w:top w:val="single" w:color="D0D6DE" w:sz="2"/>
-              <w:left w:val="single" w:color="D0D6DE" w:sz="2"/>
-              <w:bottom w:val="single" w:color="D0D6DE" w:sz="2"/>
-              <w:right w:val="single" w:color="D0D6DE" w:sz="2"/>
+              <w:top w:val="single" w:color="000000" w:sz="2"/>
+              <w:left w:val="single" w:color="000000" w:sz="2"/>
+              <w:bottom w:val="single" w:color="000000" w:sz="2"/>
+              <w:right w:val="single" w:color="000000" w:sz="2"/>
             </w:tcBorders>
             <w:tcMar>
               <w:top w:type="dxa" w:w="25"/>
@@ -1519,8 +1514,8 @@
             </w:pPr>
             <w:r>
               <w:rPr>
-                <w:rFonts w:ascii="Calibri" w:cs="Calibri" w:eastAsia="Calibri" w:hAnsi="Calibri"/>
-                <w:color w:val="1A1A1A"/>
+                <w:rFonts w:ascii="Times New Roman" w:cs="Times New Roman" w:eastAsia="Times New Roman" w:hAnsi="Times New Roman"/>
+                <w:color w:val="000000"/>
                 <w:sz w:val="17"/>
                 <w:szCs w:val="17"/>
               </w:rPr>
@@ -1532,10 +1527,10 @@
           <w:tcPr>
             <w:tcW w:type="dxa" w:w="3400"/>
             <w:tcBorders>
-              <w:top w:val="single" w:color="D0D6DE" w:sz="2"/>
-              <w:left w:val="single" w:color="D0D6DE" w:sz="2"/>
-              <w:bottom w:val="single" w:color="D0D6DE" w:sz="2"/>
-              <w:right w:val="single" w:color="D0D6DE" w:sz="2"/>
+              <w:top w:val="single" w:color="000000" w:sz="2"/>
+              <w:left w:val="single" w:color="000000" w:sz="2"/>
+              <w:bottom w:val="single" w:color="000000" w:sz="2"/>
+              <w:right w:val="single" w:color="000000" w:sz="2"/>
             </w:tcBorders>
             <w:tcMar>
               <w:top w:type="dxa" w:w="25"/>
@@ -1551,8 +1546,8 @@
             </w:pPr>
             <w:r>
               <w:rPr>
-                <w:rFonts w:ascii="Calibri" w:cs="Calibri" w:eastAsia="Calibri" w:hAnsi="Calibri"/>
-                <w:color w:val="1A1A1A"/>
+                <w:rFonts w:ascii="Times New Roman" w:cs="Times New Roman" w:eastAsia="Times New Roman" w:hAnsi="Times New Roman"/>
+                <w:color w:val="000000"/>
                 <w:sz w:val="17"/>
                 <w:szCs w:val="17"/>
               </w:rPr>
@@ -1564,10 +1559,10 @@
           <w:tcPr>
             <w:tcW w:type="dxa" w:w="520"/>
             <w:tcBorders>
-              <w:top w:val="single" w:color="D0D6DE" w:sz="2"/>
-              <w:left w:val="single" w:color="D0D6DE" w:sz="2"/>
-              <w:bottom w:val="single" w:color="D0D6DE" w:sz="2"/>
-              <w:right w:val="single" w:color="D0D6DE" w:sz="2"/>
+              <w:top w:val="single" w:color="000000" w:sz="2"/>
+              <w:left w:val="single" w:color="000000" w:sz="2"/>
+              <w:bottom w:val="single" w:color="000000" w:sz="2"/>
+              <w:right w:val="single" w:color="000000" w:sz="2"/>
             </w:tcBorders>
             <w:tcMar>
               <w:top w:type="dxa" w:w="25"/>
@@ -1583,8 +1578,8 @@
             </w:pPr>
             <w:r>
               <w:rPr>
-                <w:rFonts w:ascii="Calibri" w:cs="Calibri" w:eastAsia="Calibri" w:hAnsi="Calibri"/>
-                <w:color w:val="1A1A1A"/>
+                <w:rFonts w:ascii="Times New Roman" w:cs="Times New Roman" w:eastAsia="Times New Roman" w:hAnsi="Times New Roman"/>
+                <w:color w:val="000000"/>
                 <w:sz w:val="17"/>
                 <w:szCs w:val="17"/>
               </w:rPr>
@@ -1596,10 +1591,10 @@
           <w:tcPr>
             <w:tcW w:type="dxa" w:w="900"/>
             <w:tcBorders>
-              <w:top w:val="single" w:color="D0D6DE" w:sz="2"/>
-              <w:left w:val="single" w:color="D0D6DE" w:sz="2"/>
-              <w:bottom w:val="single" w:color="D0D6DE" w:sz="2"/>
-              <w:right w:val="single" w:color="D0D6DE" w:sz="2"/>
+              <w:top w:val="single" w:color="000000" w:sz="2"/>
+              <w:left w:val="single" w:color="000000" w:sz="2"/>
+              <w:bottom w:val="single" w:color="000000" w:sz="2"/>
+              <w:right w:val="single" w:color="000000" w:sz="2"/>
             </w:tcBorders>
             <w:tcMar>
               <w:top w:type="dxa" w:w="25"/>
@@ -1615,8 +1610,8 @@
             </w:pPr>
             <w:r>
               <w:rPr>
-                <w:rFonts w:ascii="Calibri" w:cs="Calibri" w:eastAsia="Calibri" w:hAnsi="Calibri"/>
-                <w:color w:val="1A1A1A"/>
+                <w:rFonts w:ascii="Times New Roman" w:cs="Times New Roman" w:eastAsia="Times New Roman" w:hAnsi="Times New Roman"/>
+                <w:color w:val="000000"/>
                 <w:sz w:val="17"/>
                 <w:szCs w:val="17"/>
               </w:rPr>
@@ -1628,10 +1623,10 @@
           <w:tcPr>
             <w:tcW w:type="dxa" w:w="3742"/>
             <w:tcBorders>
-              <w:top w:val="single" w:color="D0D6DE" w:sz="2"/>
-              <w:left w:val="single" w:color="D0D6DE" w:sz="2"/>
-              <w:bottom w:val="single" w:color="D0D6DE" w:sz="2"/>
-              <w:right w:val="single" w:color="D0D6DE" w:sz="2"/>
+              <w:top w:val="single" w:color="000000" w:sz="2"/>
+              <w:left w:val="single" w:color="000000" w:sz="2"/>
+              <w:bottom w:val="single" w:color="000000" w:sz="2"/>
+              <w:right w:val="single" w:color="000000" w:sz="2"/>
             </w:tcBorders>
             <w:tcMar>
               <w:top w:type="dxa" w:w="25"/>
@@ -1647,8 +1642,8 @@
             </w:pPr>
             <w:r>
               <w:rPr>
-                <w:rFonts w:ascii="Calibri" w:cs="Calibri" w:eastAsia="Calibri" w:hAnsi="Calibri"/>
-                <w:color w:val="1A1A1A"/>
+                <w:rFonts w:ascii="Times New Roman" w:cs="Times New Roman" w:eastAsia="Times New Roman" w:hAnsi="Times New Roman"/>
+                <w:color w:val="000000"/>
                 <w:sz w:val="17"/>
                 <w:szCs w:val="17"/>
               </w:rPr>
@@ -1660,12 +1655,12 @@
     </w:tbl>
     <w:p>
       <w:pPr>
-        <w:spacing w:after="20" w:before="40" w:line="238"/>
-      </w:pPr>
-      <w:r>
-        <w:rPr>
-          <w:rFonts w:ascii="Calibri" w:cs="Calibri" w:eastAsia="Calibri" w:hAnsi="Calibri"/>
-          <w:color w:val="5A5A5A"/>
+        <w:spacing w:after="20" w:before="40" w:line="234"/>
+      </w:pPr>
+      <w:r>
+        <w:rPr>
+          <w:rFonts w:ascii="Times New Roman" w:cs="Times New Roman" w:eastAsia="Times New Roman" w:hAnsi="Times New Roman"/>
+          <w:color w:val="000000"/>
           <w:sz w:val="17"/>
           <w:szCs w:val="17"/>
         </w:rPr>
@@ -1676,16 +1671,16 @@
       <w:pPr>
         <w:keepNext/>
         <w:pBdr>
-          <w:bottom w:val="single" w:color="B8C4D2" w:sz="4" w:space="1"/>
+          <w:bottom w:val="single" w:color="000000" w:sz="4" w:space="1"/>
         </w:pBdr>
         <w:spacing w:after="25" w:before="70"/>
       </w:pPr>
       <w:r>
         <w:rPr>
-          <w:rFonts w:ascii="Calibri" w:cs="Calibri" w:eastAsia="Calibri" w:hAnsi="Calibri"/>
+          <w:rFonts w:ascii="Times New Roman" w:cs="Times New Roman" w:eastAsia="Times New Roman" w:hAnsi="Times New Roman"/>
           <w:b/>
           <w:bCs/>
-          <w:color w:val="1C4E80"/>
+          <w:color w:val="000000"/>
           <w:sz w:val="19"/>
           <w:szCs w:val="19"/>
         </w:rPr>
@@ -1699,25 +1694,25 @@
           <w:ilvl w:val="0"/>
           <w:numId w:val="3"/>
         </w:numPr>
-        <w:spacing w:after="25" w:before="0" w:line="238"/>
-      </w:pPr>
-      <w:r>
-        <w:rPr>
-          <w:rFonts w:ascii="Calibri" w:cs="Calibri" w:eastAsia="Calibri" w:hAnsi="Calibri"/>
+        <w:spacing w:after="25" w:before="0" w:line="234"/>
+      </w:pPr>
+      <w:r>
+        <w:rPr>
+          <w:rFonts w:ascii="Times New Roman" w:cs="Times New Roman" w:eastAsia="Times New Roman" w:hAnsi="Times New Roman"/>
           <w:b/>
           <w:bCs/>
-          <w:color w:val="1A1A1A"/>
-          <w:sz w:val="19"/>
-          <w:szCs w:val="19"/>
+          <w:color w:val="000000"/>
+          <w:sz w:val="20"/>
+          <w:szCs w:val="20"/>
         </w:rPr>
         <w:t xml:space="preserve">Baselines </w:t>
       </w:r>
       <w:r>
         <w:rPr>
-          <w:rFonts w:ascii="Calibri" w:cs="Calibri" w:eastAsia="Calibri" w:hAnsi="Calibri"/>
-          <w:color w:val="1A1A1A"/>
-          <w:sz w:val="19"/>
-          <w:szCs w:val="19"/>
+          <w:rFonts w:ascii="Times New Roman" w:cs="Times New Roman" w:eastAsia="Times New Roman" w:hAnsi="Times New Roman"/>
+          <w:color w:val="000000"/>
+          <w:sz w:val="20"/>
+          <w:szCs w:val="20"/>
         </w:rPr>
         <w:t xml:space="preserve">(exact min-cut, greedy). First result: counting p, the cheapest full cut is a five-lane cordon on Taiwan’s west coast (effort 12.5), where all three crude ports sit; ignoring p would pick three port cyber attacks instead.</w:t>
       </w:r>
@@ -1729,25 +1724,25 @@
           <w:ilvl w:val="0"/>
           <w:numId w:val="3"/>
         </w:numPr>
-        <w:spacing w:after="25" w:before="0" w:line="238"/>
-      </w:pPr>
-      <w:r>
-        <w:rPr>
-          <w:rFonts w:ascii="Calibri" w:cs="Calibri" w:eastAsia="Calibri" w:hAnsi="Calibri"/>
+        <w:spacing w:after="25" w:before="0" w:line="234"/>
+      </w:pPr>
+      <w:r>
+        <w:rPr>
+          <w:rFonts w:ascii="Times New Roman" w:cs="Times New Roman" w:eastAsia="Times New Roman" w:hAnsi="Times New Roman"/>
           <w:b/>
           <w:bCs/>
-          <w:color w:val="1A1A1A"/>
-          <w:sz w:val="19"/>
-          <w:szCs w:val="19"/>
+          <w:color w:val="000000"/>
+          <w:sz w:val="20"/>
+          <w:szCs w:val="20"/>
         </w:rPr>
         <w:t xml:space="preserve">Agent evaluation on MIT SuperCloud </w:t>
       </w:r>
       <w:r>
         <w:rPr>
-          <w:rFonts w:ascii="Calibri" w:cs="Calibri" w:eastAsia="Calibri" w:hAnsi="Calibri"/>
-          <w:color w:val="1A1A1A"/>
-          <w:sz w:val="19"/>
-          <w:szCs w:val="19"/>
+          <w:rFonts w:ascii="Times New Roman" w:cs="Times New Roman" w:eastAsia="Times New Roman" w:hAnsi="Times New Roman"/>
+          <w:color w:val="000000"/>
+          <w:sz w:val="20"/>
+          <w:szCs w:val="20"/>
         </w:rPr>
         <w:t xml:space="preserve">(LTC Webb): zero-sum and canalize; quarantine and blockade variants.</w:t>
       </w:r>
@@ -1759,102 +1754,102 @@
           <w:ilvl w:val="0"/>
           <w:numId w:val="3"/>
         </w:numPr>
-        <w:spacing w:after="25" w:before="0" w:line="238"/>
-      </w:pPr>
-      <w:r>
-        <w:rPr>
-          <w:rFonts w:ascii="Calibri" w:cs="Calibri" w:eastAsia="Calibri" w:hAnsi="Calibri"/>
+        <w:spacing w:after="25" w:before="0" w:line="234"/>
+      </w:pPr>
+      <w:r>
+        <w:rPr>
+          <w:rFonts w:ascii="Times New Roman" w:cs="Times New Roman" w:eastAsia="Times New Roman" w:hAnsi="Times New Roman"/>
           <w:b/>
           <w:bCs/>
-          <w:color w:val="1A1A1A"/>
+          <w:color w:val="000000"/>
+          <w:sz w:val="20"/>
+          <w:szCs w:val="20"/>
+        </w:rPr>
+        <w:t xml:space="preserve">Transfer test: </w:t>
+      </w:r>
+      <w:r>
+        <w:rPr>
+          <w:rFonts w:ascii="Times New Roman" w:cs="Times New Roman" w:eastAsia="Times New Roman" w:hAnsi="Times New Roman"/>
+          <w:color w:val="000000"/>
+          <w:sz w:val="20"/>
+          <w:szCs w:val="20"/>
+        </w:rPr>
+        <w:t xml:space="preserve">the rail-trained agent on this network, no retraining. If it transfers, it learned interdiction rather than a map; if not, that is a result.</w:t>
+      </w:r>
+    </w:p>
+    <w:p>
+      <w:pPr>
+        <w:spacing w:after="40" w:before="15" w:line="234"/>
+      </w:pPr>
+      <w:r>
+        <w:rPr>
+          <w:rFonts w:ascii="Times New Roman" w:cs="Times New Roman" w:eastAsia="Times New Roman" w:hAnsi="Times New Roman"/>
+          <w:b/>
+          <w:bCs/>
+          <w:color w:val="000000"/>
+          <w:sz w:val="20"/>
+          <w:szCs w:val="20"/>
+        </w:rPr>
+        <w:t xml:space="preserve">Products: </w:t>
+      </w:r>
+      <w:r>
+        <w:rPr>
+          <w:rFonts w:ascii="Times New Roman" w:cs="Times New Roman" w:eastAsia="Times New Roman" w:hAnsi="Times New Roman"/>
+          <w:color w:val="000000"/>
+          <w:sz w:val="20"/>
+          <w:szCs w:val="20"/>
+        </w:rPr>
+        <w:t xml:space="preserve">effort–flow frontier (budget vs. crude delivered, for min-cut, greedy and the agent); map of where the agent acts by budget; transfer result; poster.</w:t>
+      </w:r>
+    </w:p>
+    <w:p>
+      <w:pPr>
+        <w:keepNext/>
+        <w:pBdr>
+          <w:bottom w:val="single" w:color="000000" w:sz="4" w:space="1"/>
+        </w:pBdr>
+        <w:spacing w:after="25" w:before="70"/>
+      </w:pPr>
+      <w:r>
+        <w:rPr>
+          <w:rFonts w:ascii="Times New Roman" w:cs="Times New Roman" w:eastAsia="Times New Roman" w:hAnsi="Times New Roman"/>
+          <w:b/>
+          <w:bCs/>
+          <w:color w:val="000000"/>
           <w:sz w:val="19"/>
           <w:szCs w:val="19"/>
         </w:rPr>
-        <w:t xml:space="preserve">Transfer test: </w:t>
-      </w:r>
-      <w:r>
-        <w:rPr>
-          <w:rFonts w:ascii="Calibri" w:cs="Calibri" w:eastAsia="Calibri" w:hAnsi="Calibri"/>
-          <w:color w:val="1A1A1A"/>
-          <w:sz w:val="19"/>
-          <w:szCs w:val="19"/>
-        </w:rPr>
-        <w:t xml:space="preserve">the rail-trained agent on this network, no retraining. If it transfers, it learned interdiction rather than a map; if not, that is a result.</w:t>
-      </w:r>
-    </w:p>
-    <w:p>
-      <w:pPr>
-        <w:spacing w:after="40" w:before="15" w:line="238"/>
-      </w:pPr>
-      <w:r>
-        <w:rPr>
-          <w:rFonts w:ascii="Calibri" w:cs="Calibri" w:eastAsia="Calibri" w:hAnsi="Calibri"/>
+        <w:t xml:space="preserve">ASSUMPTIONS AND LIMITS</w:t>
+      </w:r>
+    </w:p>
+    <w:p>
+      <w:pPr>
+        <w:spacing w:after="40" w:before="0" w:line="234"/>
+      </w:pPr>
+      <w:r>
+        <w:rPr>
+          <w:rFonts w:ascii="Times New Roman" w:cs="Times New Roman" w:eastAsia="Times New Roman" w:hAnsi="Times New Roman"/>
+          <w:color w:val="000000"/>
+          <w:sz w:val="20"/>
+          <w:szCs w:val="20"/>
+        </w:rPr>
+        <w:t xml:space="preserve">Keeps LTC Webb's framework: two players (Stackelberg), full information, zero-sum, one round. Adds: 2025 supplier mix fixed; one month, one commodity, no stock drawdown; no escorts; ordinal costs and an assumed carrier p, both swept for sensitivity; nine strait and canal capacities pending the EIA chokepoint report. Unclassified sources only; a proof of concept, not a targeting model.</w:t>
+      </w:r>
+    </w:p>
+    <w:p>
+      <w:pPr>
+        <w:keepNext/>
+        <w:pBdr>
+          <w:bottom w:val="single" w:color="000000" w:sz="4" w:space="1"/>
+        </w:pBdr>
+        <w:spacing w:after="25" w:before="70"/>
+      </w:pPr>
+      <w:r>
+        <w:rPr>
+          <w:rFonts w:ascii="Times New Roman" w:cs="Times New Roman" w:eastAsia="Times New Roman" w:hAnsi="Times New Roman"/>
           <w:b/>
           <w:bCs/>
-          <w:color w:val="1A1A1A"/>
-          <w:sz w:val="19"/>
-          <w:szCs w:val="19"/>
-        </w:rPr>
-        <w:t xml:space="preserve">Products: </w:t>
-      </w:r>
-      <w:r>
-        <w:rPr>
-          <w:rFonts w:ascii="Calibri" w:cs="Calibri" w:eastAsia="Calibri" w:hAnsi="Calibri"/>
-          <w:color w:val="1A1A1A"/>
-          <w:sz w:val="19"/>
-          <w:szCs w:val="19"/>
-        </w:rPr>
-        <w:t xml:space="preserve">effort–flow frontier (budget vs. crude delivered, for min-cut, greedy and the agent); map of where the agent acts by budget; transfer result; poster.</w:t>
-      </w:r>
-    </w:p>
-    <w:p>
-      <w:pPr>
-        <w:keepNext/>
-        <w:pBdr>
-          <w:bottom w:val="single" w:color="B8C4D2" w:sz="4" w:space="1"/>
-        </w:pBdr>
-        <w:spacing w:after="25" w:before="70"/>
-      </w:pPr>
-      <w:r>
-        <w:rPr>
-          <w:rFonts w:ascii="Calibri" w:cs="Calibri" w:eastAsia="Calibri" w:hAnsi="Calibri"/>
-          <w:b/>
-          <w:bCs/>
-          <w:color w:val="1C4E80"/>
-          <w:sz w:val="19"/>
-          <w:szCs w:val="19"/>
-        </w:rPr>
-        <w:t xml:space="preserve">ASSUMPTIONS AND LIMITS</w:t>
-      </w:r>
-    </w:p>
-    <w:p>
-      <w:pPr>
-        <w:spacing w:after="40" w:before="0" w:line="238"/>
-      </w:pPr>
-      <w:r>
-        <w:rPr>
-          <w:rFonts w:ascii="Calibri" w:cs="Calibri" w:eastAsia="Calibri" w:hAnsi="Calibri"/>
-          <w:color w:val="1A1A1A"/>
-          <w:sz w:val="19"/>
-          <w:szCs w:val="19"/>
-        </w:rPr>
-        <w:t xml:space="preserve">Keeps LTC Webb's framework: two players (Stackelberg), full information, zero-sum, one round. Adds: 2025 supplier mix fixed; one month, one commodity, no stock drawdown; no escorts; ordinal costs and an assumed carrier p, both swept for sensitivity; nine strait and canal capacities pending the EIA chokepoint report. Unclassified sources only; a proof of concept, not a targeting model.</w:t>
-      </w:r>
-    </w:p>
-    <w:p>
-      <w:pPr>
-        <w:keepNext/>
-        <w:pBdr>
-          <w:bottom w:val="single" w:color="B8C4D2" w:sz="4" w:space="1"/>
-        </w:pBdr>
-        <w:spacing w:after="25" w:before="70"/>
-      </w:pPr>
-      <w:r>
-        <w:rPr>
-          <w:rFonts w:ascii="Calibri" w:cs="Calibri" w:eastAsia="Calibri" w:hAnsi="Calibri"/>
-          <w:b/>
-          <w:bCs/>
-          <w:color w:val="1C4E80"/>
+          <w:color w:val="000000"/>
           <w:sz w:val="19"/>
           <w:szCs w:val="19"/>
         </w:rPr>
@@ -1868,25 +1863,25 @@
           <w:ilvl w:val="0"/>
           <w:numId w:val="4"/>
         </w:numPr>
-        <w:spacing w:after="25" w:before="0" w:line="238"/>
-      </w:pPr>
-      <w:r>
-        <w:rPr>
-          <w:rFonts w:ascii="Calibri" w:cs="Calibri" w:eastAsia="Calibri" w:hAnsi="Calibri"/>
+        <w:spacing w:after="25" w:before="0" w:line="234"/>
+      </w:pPr>
+      <w:r>
+        <w:rPr>
+          <w:rFonts w:ascii="Times New Roman" w:cs="Times New Roman" w:eastAsia="Times New Roman" w:hAnsi="Times New Roman"/>
           <w:b/>
           <w:bCs/>
-          <w:color w:val="1A1A1A"/>
-          <w:sz w:val="19"/>
-          <w:szCs w:val="19"/>
+          <w:color w:val="000000"/>
+          <w:sz w:val="20"/>
+          <w:szCs w:val="20"/>
         </w:rPr>
         <w:t xml:space="preserve">Stochastic outcomes? </w:t>
       </w:r>
       <w:r>
         <w:rPr>
-          <w:rFonts w:ascii="Calibri" w:cs="Calibri" w:eastAsia="Calibri" w:hAnsi="Calibri"/>
-          <w:color w:val="1A1A1A"/>
-          <w:sz w:val="19"/>
-          <w:szCs w:val="19"/>
+          <w:rFonts w:ascii="Times New Roman" w:cs="Times New Roman" w:eastAsia="Times New Roman" w:hAnsi="Times New Roman"/>
+          <w:color w:val="000000"/>
+          <w:sz w:val="20"/>
+          <w:szCs w:val="20"/>
         </w:rPr>
         <w:t xml:space="preserve">The training code runs stochastic; the meeting notes say deterministic. The effort budget needs p below 1.</w:t>
       </w:r>
@@ -1898,25 +1893,25 @@
           <w:ilvl w:val="0"/>
           <w:numId w:val="4"/>
         </w:numPr>
-        <w:spacing w:after="25" w:before="0" w:line="238"/>
-      </w:pPr>
-      <w:r>
-        <w:rPr>
-          <w:rFonts w:ascii="Calibri" w:cs="Calibri" w:eastAsia="Calibri" w:hAnsi="Calibri"/>
+        <w:spacing w:after="25" w:before="0" w:line="234"/>
+      </w:pPr>
+      <w:r>
+        <w:rPr>
+          <w:rFonts w:ascii="Times New Roman" w:cs="Times New Roman" w:eastAsia="Times New Roman" w:hAnsi="Times New Roman"/>
           <w:b/>
           <w:bCs/>
-          <w:color w:val="1A1A1A"/>
-          <w:sz w:val="19"/>
-          <w:szCs w:val="19"/>
+          <w:color w:val="000000"/>
+          <w:sz w:val="20"/>
+          <w:szCs w:val="20"/>
         </w:rPr>
         <w:t xml:space="preserve">Evaluation inputs? </w:t>
       </w:r>
       <w:r>
         <w:rPr>
-          <w:rFonts w:ascii="Calibri" w:cs="Calibri" w:eastAsia="Calibri" w:hAnsi="Calibri"/>
-          <w:color w:val="1A1A1A"/>
-          <w:sz w:val="19"/>
-          <w:szCs w:val="19"/>
+          <w:rFonts w:ascii="Times New Roman" w:cs="Times New Roman" w:eastAsia="Times New Roman" w:hAnsi="Times New Roman"/>
+          <w:color w:val="000000"/>
+          <w:sz w:val="20"/>
+          <w:szCs w:val="20"/>
         </w:rPr>
         <w:t xml:space="preserve">Use the sourced capacities, costs and p when testing on this network (_update_capacity_constraints_from_dict).</w:t>
       </w:r>
@@ -1928,25 +1923,25 @@
           <w:ilvl w:val="0"/>
           <w:numId w:val="4"/>
         </w:numPr>
-        <w:spacing w:after="25" w:before="0" w:line="238"/>
-      </w:pPr>
-      <w:r>
-        <w:rPr>
-          <w:rFonts w:ascii="Calibri" w:cs="Calibri" w:eastAsia="Calibri" w:hAnsi="Calibri"/>
+        <w:spacing w:after="25" w:before="0" w:line="234"/>
+      </w:pPr>
+      <w:r>
+        <w:rPr>
+          <w:rFonts w:ascii="Times New Roman" w:cs="Times New Roman" w:eastAsia="Times New Roman" w:hAnsi="Times New Roman"/>
           <w:b/>
           <w:bCs/>
-          <w:color w:val="1A1A1A"/>
-          <w:sz w:val="19"/>
-          <w:szCs w:val="19"/>
+          <w:color w:val="000000"/>
+          <w:sz w:val="20"/>
+          <w:szCs w:val="20"/>
         </w:rPr>
         <w:t xml:space="preserve">Supplier arcs? </w:t>
       </w:r>
       <w:r>
         <w:rPr>
-          <w:rFonts w:ascii="Calibri" w:cs="Calibri" w:eastAsia="Calibri" w:hAnsi="Calibri"/>
-          <w:color w:val="1A1A1A"/>
-          <w:sz w:val="19"/>
-          <w:szCs w:val="19"/>
+          <w:rFonts w:ascii="Times New Roman" w:cs="Times New Roman" w:eastAsia="Times New Roman" w:hAnsi="Times New Roman"/>
+          <w:color w:val="000000"/>
+          <w:sz w:val="20"/>
+          <w:szCs w:val="20"/>
         </w:rPr>
         <w:t xml:space="preserve">May economic pressure make the super-source arcs interdictable? The Ukraine network does not.</w:t>
       </w:r>
@@ -1957,10 +1952,10 @@
       </w:pPr>
       <w:r>
         <w:rPr>
-          <w:rFonts w:ascii="Calibri" w:cs="Calibri" w:eastAsia="Calibri" w:hAnsi="Calibri"/>
+          <w:rFonts w:ascii="Times New Roman" w:cs="Times New Roman" w:eastAsia="Times New Roman" w:hAnsi="Times New Roman"/>
           <w:b/>
           <w:bCs/>
-          <w:color w:val="5A5A5A"/>
+          <w:color w:val="000000"/>
           <w:sz w:val="15"/>
           <w:szCs w:val="15"/>
         </w:rPr>
@@ -1968,8 +1963,8 @@
       </w:r>
       <w:r>
         <w:rPr>
-          <w:rFonts w:ascii="Calibri" w:cs="Calibri" w:eastAsia="Calibri" w:hAnsi="Calibri"/>
-          <w:color w:val="5A5A5A"/>
+          <w:rFonts w:ascii="Times New Roman" w:cs="Times New Roman" w:eastAsia="Times New Roman" w:hAnsi="Times New Roman"/>
+          <w:color w:val="000000"/>
           <w:sz w:val="15"/>
           <w:szCs w:val="15"/>
         </w:rPr>
@@ -2030,8 +2025,8 @@
       </w:pPr>
       <w:r>
         <w:rPr>
-          <w:rFonts w:ascii="Calibri" w:cs="Calibri" w:eastAsia="Calibri" w:hAnsi="Calibri"/>
-          <w:color w:val="5A5A5A"/>
+          <w:rFonts w:ascii="Times New Roman" w:cs="Times New Roman" w:eastAsia="Times New Roman" w:hAnsi="Times New Roman"/>
+          <w:color w:val="000000"/>
           <w:sz w:val="17"/>
           <w:szCs w:val="17"/>
         </w:rPr>
@@ -2091,8 +2086,8 @@
       </w:pPr>
       <w:r>
         <w:rPr>
-          <w:rFonts w:ascii="Calibri" w:cs="Calibri" w:eastAsia="Calibri" w:hAnsi="Calibri"/>
-          <w:color w:val="5A5A5A"/>
+          <w:rFonts w:ascii="Times New Roman" w:cs="Times New Roman" w:eastAsia="Times New Roman" w:hAnsi="Times New Roman"/>
+          <w:color w:val="000000"/>
           <w:sz w:val="17"/>
           <w:szCs w:val="17"/>
         </w:rPr>
@@ -2101,7 +2096,7 @@
     </w:p>
     <w:sectPr>
       <w:pgSz w:w="12240" w:h="15840" w:orient="portrait"/>
-      <w:pgMar w:top="720" w:right="864" w:bottom="720" w:left="864" w:header="708" w:footer="708" w:gutter="0"/>
+      <w:pgMar w:top="720" w:right="792" w:bottom="720" w:left="792" w:header="708" w:footer="708" w:gutter="0"/>
       <w:pgNumType/>
       <w:docGrid w:linePitch="360"/>
     </w:sectPr>
@@ -2341,10 +2336,10 @@
   <w:docDefaults>
     <w:rPrDefault>
       <w:rPr>
-        <w:rFonts w:ascii="Calibri" w:cs="Calibri" w:eastAsia="Calibri" w:hAnsi="Calibri"/>
-        <w:color w:val="1A1A1A"/>
-        <w:sz w:val="19"/>
-        <w:szCs w:val="19"/>
+        <w:rFonts w:ascii="Times New Roman" w:cs="Times New Roman" w:eastAsia="Times New Roman" w:hAnsi="Times New Roman"/>
+        <w:color w:val="000000"/>
+        <w:sz w:val="20"/>
+        <w:szCs w:val="20"/>
       </w:rPr>
     </w:rPrDefault>
     <w:pPrDefault/>

</xml_diff>

<commit_message>
MA289-27-1: costs on a 0-100 budget scale; updated figures and proposal
Co-Authored-By: Claude Opus 5.5 <noreply@anthropic.com>
Claude-Session: https://claude.ai/code/session_01LktEwgLv6jhvgy7W4UNjwx
</commit_message>
<xml_diff>
--- a/ma289-27-1-proposal.docx
+++ b/ma289-27-1-proposal.docx
@@ -291,7 +291,7 @@
           <w:sz w:val="20"/>
           <w:szCs w:val="20"/>
         </w:rPr>
-        <w:t xml:space="preserve">The attacker spends one effort budget. Each edge carries the one action that fits where it is, with an effort cost and a probability p that it shuts the edge (the expected share of the month closed), which is the per-edge cost and probability env_TA.py already uses. p is anchored on real disruptions; costs are ordinal, by legal threshold and distance from PRC bases.</w:t>
+        <w:t xml:space="preserve">The attacker spends one effort budget. Each edge carries the one action that fits where it is, with an effort cost and a probability p that it shuts the edge (the expected share of the month closed), which is the per-edge cost and probability env_TA.py already uses. p is anchored on real disruptions; costs are percent of a fixed budget of 100, ranked by legal threshold and distance from PRC bases.</w:t>
       </w:r>
     </w:p>
     <w:tbl>
@@ -587,7 +587,7 @@
                 <w:sz w:val="17"/>
                 <w:szCs w:val="17"/>
               </w:rPr>
-              <w:t xml:space="preserve">1</w:t>
+              <w:t xml:space="preserve">5</w:t>
             </w:r>
           </w:p>
         </w:tc>
@@ -753,7 +753,7 @@
                 <w:sz w:val="17"/>
                 <w:szCs w:val="17"/>
               </w:rPr>
-              <w:t xml:space="preserve">1</w:t>
+              <w:t xml:space="preserve">5</w:t>
             </w:r>
           </w:p>
         </w:tc>
@@ -919,7 +919,7 @@
                 <w:sz w:val="17"/>
                 <w:szCs w:val="17"/>
               </w:rPr>
-              <w:t xml:space="preserve">2 / 4</w:t>
+              <w:t xml:space="preserve">10/20</w:t>
             </w:r>
           </w:p>
         </w:tc>
@@ -951,7 +951,7 @@
                 <w:sz w:val="17"/>
                 <w:szCs w:val="17"/>
               </w:rPr>
-              <w:t xml:space="preserve">0.80 / 0.95</w:t>
+              <w:t xml:space="preserve">0.80/0.95</w:t>
             </w:r>
           </w:p>
         </w:tc>
@@ -1085,7 +1085,7 @@
                 <w:sz w:val="17"/>
                 <w:szCs w:val="17"/>
               </w:rPr>
-              <w:t xml:space="preserve">2</w:t>
+              <w:t xml:space="preserve">10</w:t>
             </w:r>
           </w:p>
         </w:tc>
@@ -1251,7 +1251,7 @@
                 <w:sz w:val="17"/>
                 <w:szCs w:val="17"/>
               </w:rPr>
-              <w:t xml:space="preserve">3</w:t>
+              <w:t xml:space="preserve">15</w:t>
             </w:r>
           </w:p>
         </w:tc>
@@ -1417,7 +1417,7 @@
                 <w:sz w:val="17"/>
                 <w:szCs w:val="17"/>
               </w:rPr>
-              <w:t xml:space="preserve">3</w:t>
+              <w:t xml:space="preserve">15</w:t>
             </w:r>
           </w:p>
         </w:tc>
@@ -1583,7 +1583,7 @@
                 <w:sz w:val="17"/>
                 <w:szCs w:val="17"/>
               </w:rPr>
-              <w:t xml:space="preserve">4</w:t>
+              <w:t xml:space="preserve">20</w:t>
             </w:r>
           </w:p>
         </w:tc>
@@ -1714,7 +1714,7 @@
           <w:sz w:val="20"/>
           <w:szCs w:val="20"/>
         </w:rPr>
-        <w:t xml:space="preserve">(exact min-cut, greedy). First result: counting p, the cheapest full cut is a five-lane cordon on Taiwan’s west coast (effort 12.5), where all three crude ports sit; ignoring p would pick three port cyber attacks instead.</w:t>
+        <w:t xml:space="preserve">(exact min-cut, greedy). First result: counting p, the cheapest full cut is a five-lane cordon on Taiwan’s west coast (half the budget), where all three crude ports sit; ignoring p would pick three port cyber attacks instead.</w:t>
       </w:r>
     </w:p>
     <w:p>
@@ -1833,7 +1833,7 @@
           <w:sz w:val="20"/>
           <w:szCs w:val="20"/>
         </w:rPr>
-        <w:t xml:space="preserve">Keeps LTC Webb's framework: two players (Stackelberg), full information, zero-sum, one round. Adds: supplier upper bounds (highest share found); one month, one commodity, no stock drawdown; no escorts; ordinal costs and an assumed carrier p, both swept for sensitivity; transit time does not reduce monthly flow; strait and canal capacities set to Taiwan's share of Northeast Asian imports (Lombok and Sulu fleet-limited). Unclassified sources only; a proof of concept, not a targeting model.</w:t>
+        <w:t xml:space="preserve">Keeps LTC Webb's framework: two players (Stackelberg), full information, zero-sum, one round. Adds: supplier caps (highest share found); chokepoint caps at Taiwan’s 4.5% share of Northeast Asian imports; one month, one commodity, no stock drawdown, transit time ignored; no escorts; ranked costs and an assumed carrier p, swept for sensitivity. Unclassified sources only; a proof of concept, not a targeting model.</w:t>
       </w:r>
     </w:p>
     <w:p>

</xml_diff>

<commit_message>
MA289-27-1: pipelines removed, Hormuz slowed not closed, U.S. route through Suez
Co-Authored-By: Claude Opus 5.5 <noreply@anthropic.com>
Claude-Session: https://claude.ai/code/session_01LktEwgLv6jhvgy7W4UNjwx
</commit_message>
<xml_diff>
--- a/ma289-27-1-proposal.docx
+++ b/ma289-27-1-proposal.docx
@@ -117,7 +117,7 @@
           <w:sz w:val="20"/>
           <w:szCs w:val="20"/>
         </w:rPr>
-        <w:t xml:space="preserve">Taiwan imports nearly all of its crude: in 2025, 61% from Persian Gulf producers through Hormuz, 27% from the U.S. Gulf Coast, 8% from Oman (EIA, 2026). Every barrel must pass a few named straits, so the open ocean reduces to a finite, closed graph. The structure is real: Hormuz has been largely closed since February 2026, and Taiwan reportedly rerouted through the Saudi Red Sea port of Yanbu, a route this network contains.</w:t>
+        <w:t xml:space="preserve">Taiwan imports nearly all of its crude: in 2025, 61% from Persian Gulf producers through Hormuz, 27% from the U.S. Gulf Coast, 8% from Oman (EIA, 2026). Every barrel must pass a few named straits, so the open ocean reduces to a finite, closed graph. The structure is real: Hormuz has been largely closed by Iran since February 2026, and Taiwan has shifted toward U.S. crude (about 60% by April 2026).</w:t>
       </w:r>
     </w:p>
     <w:p>
@@ -167,7 +167,7 @@
           <w:sz w:val="20"/>
           <w:szCs w:val="20"/>
         </w:rPr>
-        <w:t xml:space="preserve">55 nodes, 78 edges (59 interdictable), vs. 70 and 125 for Ukraine; loads into env_TA.py unchanged (Figure 1).</w:t>
+        <w:t xml:space="preserve">57 nodes, 79 edges (59 interdictable), vs. 70 and 125 for Ukraine; loads into env_TA.py unchanged (Figure 1).</w:t>
       </w:r>
     </w:p>
     <w:p>
@@ -227,7 +227,7 @@
           <w:sz w:val="20"/>
           <w:szCs w:val="20"/>
         </w:rPr>
-        <w:t xml:space="preserve">each strait or canal is an edge from entrance to exit; a node at every junction; every interdictable lane has a checked alternative (for Hormuz, the two bypass pipelines).</w:t>
+        <w:t xml:space="preserve">each strait or canal is an edge from entrance to exit; a node at every junction; every interdictable lane has a checked alternative. Hormuz can be slowed, not closed: China can remove a 20% delayed share.</w:t>
       </w:r>
     </w:p>
     <w:p>
@@ -1983,7 +1983,7 @@
           <wp:inline distT="0" distB="0" distL="0" distR="0">
             <wp:extent cx="6667500" cy="3705225"/>
             <wp:effectExtent t="0" r="0" b="0" l="0"/>
-            <wp:docPr id="1" name="fig10_oil_schematic.png" descr="Figure 1. The network as the model sees it: 55 nodes and 78 edges, numbered with the IDs env_TA.py reads. Left to right follows the voyage; the Taiwan approaches are on the right, with the super-sink (demand, 11.9 VLCC loads a month) inside the ring. Edge shade is the effort cost of the action available there; grey dashed edges cannot be interdicted." title="Figure 1"/>
+            <wp:docPr id="1" name="fig10_oil_schematic.png" descr="Figure 1. The network as the model sees it: 57 nodes and 79 edges, numbered with the IDs env_TA.py reads. Left to right follows the voyage; the Taiwan approaches are on the right, with the super-sink (demand, 11.9 VLCC loads a month) inside the ring. Edge shade is the effort cost of the action available there; grey dashed edges cannot be interdicted." title="Figure 1"/>
             <wp:cNvGraphicFramePr>
               <a:graphicFrameLocks xmlns:a="http://schemas.openxmlformats.org/drawingml/2006/main" noChangeAspect="1"/>
             </wp:cNvGraphicFramePr>
@@ -2030,7 +2030,7 @@
           <w:sz w:val="17"/>
           <w:szCs w:val="17"/>
         </w:rPr>
-        <w:t xml:space="preserve">Figure 1. The network as the model sees it: 55 nodes and 78 edges, numbered with the IDs env_TA.py reads. Left to right follows the voyage; the Taiwan approaches are on the right, with the super-sink (demand, 11.9 VLCC loads a month) inside the ring. Edge shade is the effort cost of the action available there; grey dashed edges cannot be interdicted.</w:t>
+        <w:t xml:space="preserve">Figure 1. The network as the model sees it: 57 nodes and 79 edges, numbered with the IDs env_TA.py reads. Left to right follows the voyage; the Taiwan approaches are on the right, with the super-sink (demand, 11.9 VLCC loads a month) inside the ring. Edge shade is the effort cost of the action available there; grey dashed edges cannot be interdicted.</w:t>
       </w:r>
     </w:p>
     <w:p>

</xml_diff>